<commit_message>
resolve merge conflicts in documentation files
</commit_message>
<xml_diff>
--- a/working/sequenceD/Sequence Diagram.docx
+++ b/working/sequenceD/Sequence Diagram.docx
@@ -1,6 +1,6 @@
 
 <file path=word/document.xml><?xml version="1.0" encoding="utf-8"?>
-<w:document xmlns:wpc="http://schemas.microsoft.com/office/word/2010/wordprocessingCanvas" xmlns:cx="http://schemas.microsoft.com/office/drawing/2014/chartex" xmlns:cx1="http://schemas.microsoft.com/office/drawing/2015/9/8/chartex" xmlns:cx2="http://schemas.microsoft.com/office/drawing/2015/10/21/chartex" xmlns:cx3="http://schemas.microsoft.com/office/drawing/2016/5/9/chartex" xmlns:cx4="http://schemas.microsoft.com/office/drawing/2016/5/10/chartex" xmlns:cx5="http://schemas.microsoft.com/office/drawing/2016/5/11/chartex" xmlns:cx6="http://schemas.microsoft.com/office/drawing/2016/5/12/chartex" xmlns:cx7="http://schemas.microsoft.com/office/drawing/2016/5/13/chartex" xmlns:cx8="http://schemas.microsoft.com/office/drawing/2016/5/14/chartex" xmlns:mc="http://schemas.openxmlformats.org/markup-compatibility/2006" xmlns:aink="http://schemas.microsoft.com/office/drawing/2016/ink" xmlns:am3d="http://schemas.microsoft.com/office/drawing/2017/model3d" xmlns:o="urn:schemas-microsoft-com:office:office" xmlns:r="http://schemas.openxmlformats.org/officeDocument/2006/relationships" xmlns:m="http://schemas.openxmlformats.org/officeDocument/2006/math" xmlns:v="urn:schemas-microsoft-com:vml" xmlns:wp14="http://schemas.microsoft.com/office/word/2010/wordprocessingDrawing" xmlns:wp="http://schemas.openxmlformats.org/drawingml/2006/wordprocessingDrawing" xmlns:w10="urn:schemas-microsoft-com:office:word" xmlns:w="http://schemas.openxmlformats.org/wordprocessingml/2006/main" xmlns:w14="http://schemas.microsoft.com/office/word/2010/wordml" xmlns:w15="http://schemas.microsoft.com/office/word/2012/wordml" xmlns:w16cex="http://schemas.microsoft.com/office/word/2018/wordml/cex" xmlns:w16cid="http://schemas.microsoft.com/office/word/2016/wordml/cid" xmlns:w16="http://schemas.microsoft.com/office/word/2018/wordml" xmlns:w16sdtdh="http://schemas.microsoft.com/office/word/2020/wordml/sdtdatahash" xmlns:w16se="http://schemas.microsoft.com/office/word/2015/wordml/symex" xmlns:wpg="http://schemas.microsoft.com/office/word/2010/wordprocessingGroup" xmlns:wpi="http://schemas.microsoft.com/office/word/2010/wordprocessingInk" xmlns:wne="http://schemas.microsoft.com/office/word/2006/wordml" xmlns:wps="http://schemas.microsoft.com/office/word/2010/wordprocessingShape" mc:Ignorable="w14 w15 w16se w16cid w16 w16cex w16sdtdh wp14">
+<w:document xmlns:wpc="http://schemas.microsoft.com/office/word/2010/wordprocessingCanvas" xmlns:cx="http://schemas.microsoft.com/office/drawing/2014/chartex" xmlns:cx1="http://schemas.microsoft.com/office/drawing/2015/9/8/chartex" xmlns:cx2="http://schemas.microsoft.com/office/drawing/2015/10/21/chartex" xmlns:cx3="http://schemas.microsoft.com/office/drawing/2016/5/9/chartex" xmlns:cx4="http://schemas.microsoft.com/office/drawing/2016/5/10/chartex" xmlns:cx5="http://schemas.microsoft.com/office/drawing/2016/5/11/chartex" xmlns:cx6="http://schemas.microsoft.com/office/drawing/2016/5/12/chartex" xmlns:cx7="http://schemas.microsoft.com/office/drawing/2016/5/13/chartex" xmlns:cx8="http://schemas.microsoft.com/office/drawing/2016/5/14/chartex" xmlns:mc="http://schemas.openxmlformats.org/markup-compatibility/2006" xmlns:aink="http://schemas.microsoft.com/office/drawing/2016/ink" xmlns:am3d="http://schemas.microsoft.com/office/drawing/2017/model3d" xmlns:o="urn:schemas-microsoft-com:office:office" xmlns:oel="http://schemas.microsoft.com/office/2019/extlst" xmlns:r="http://schemas.openxmlformats.org/officeDocument/2006/relationships" xmlns:m="http://schemas.openxmlformats.org/officeDocument/2006/math" xmlns:v="urn:schemas-microsoft-com:vml" xmlns:wp14="http://schemas.microsoft.com/office/word/2010/wordprocessingDrawing" xmlns:wp="http://schemas.openxmlformats.org/drawingml/2006/wordprocessingDrawing" xmlns:w10="urn:schemas-microsoft-com:office:word" xmlns:w="http://schemas.openxmlformats.org/wordprocessingml/2006/main" xmlns:w14="http://schemas.microsoft.com/office/word/2010/wordml" xmlns:w15="http://schemas.microsoft.com/office/word/2012/wordml" xmlns:w16cex="http://schemas.microsoft.com/office/word/2018/wordml/cex" xmlns:w16cid="http://schemas.microsoft.com/office/word/2016/wordml/cid" xmlns:w16="http://schemas.microsoft.com/office/word/2018/wordml" xmlns:w16du="http://schemas.microsoft.com/office/word/2023/wordml/word16du" xmlns:w16sdtdh="http://schemas.microsoft.com/office/word/2020/wordml/sdtdatahash" xmlns:w16sdtfl="http://schemas.microsoft.com/office/word/2024/wordml/sdtformatlock" xmlns:w16se="http://schemas.microsoft.com/office/word/2015/wordml/symex" xmlns:wpg="http://schemas.microsoft.com/office/word/2010/wordprocessingGroup" xmlns:wpi="http://schemas.microsoft.com/office/word/2010/wordprocessingInk" xmlns:wne="http://schemas.microsoft.com/office/word/2006/wordml" xmlns:wps="http://schemas.microsoft.com/office/word/2010/wordprocessingShape" mc:Ignorable="w14 w15 w16se w16cid w16 w16cex w16sdtdh w16sdtfl w16du wp14">
   <w:body>
     <w:p>
       <w:pPr>
@@ -23,7 +23,7 @@
           <w:szCs w:val="48"/>
         </w:rPr>
         <w:drawing>
-          <wp:anchor distT="0" distB="0" distL="114300" distR="114300" simplePos="0" relativeHeight="251659264" behindDoc="0" locked="0" layoutInCell="1" allowOverlap="1" wp14:anchorId="1D14625C" wp14:editId="5A804729">
+          <wp:anchor distT="0" distB="0" distL="114300" distR="114300" simplePos="0" relativeHeight="251659264" behindDoc="0" locked="0" layoutInCell="1" allowOverlap="1" wp14:anchorId="1D14625C" wp14:editId="160D8FD8">
             <wp:simplePos x="0" y="0"/>
             <wp:positionH relativeFrom="margin">
               <wp:posOffset>4670425</wp:posOffset>
@@ -2369,6 +2369,7 @@
           <w:szCs w:val="28"/>
           <w:lang w:bidi="ar-EG"/>
         </w:rPr>
+        <w:lastRenderedPageBreak/>
         <w:t>Key features include:</w:t>
       </w:r>
     </w:p>
@@ -2386,290 +2387,290 @@
           <w:szCs w:val="28"/>
           <w:lang w:bidi="ar-EG"/>
         </w:rPr>
+        <w:t xml:space="preserve">Visual guidance for the visually impaired: Cameras and sensors </w:t>
+      </w:r>
+      <w:proofErr w:type="gramStart"/>
+      <w:r>
+        <w:rPr>
+          <w:sz w:val="28"/>
+          <w:szCs w:val="28"/>
+          <w:lang w:bidi="ar-EG"/>
+        </w:rPr>
+        <w:t>detect</w:t>
+      </w:r>
+      <w:proofErr w:type="gramEnd"/>
+      <w:r>
+        <w:rPr>
+          <w:sz w:val="28"/>
+          <w:szCs w:val="28"/>
+          <w:lang w:bidi="ar-EG"/>
+        </w:rPr>
+        <w:t xml:space="preserve"> obstacles, directional cues, and important environmental features, providing audio alerts and instructions such as “move forward,” “obstacle ahead,” or “turn left.”</w:t>
+      </w:r>
+    </w:p>
+    <w:p>
+      <w:pPr>
+        <w:rPr>
+          <w:sz w:val="28"/>
+          <w:szCs w:val="28"/>
+          <w:lang w:bidi="ar-EG"/>
+        </w:rPr>
+      </w:pPr>
+      <w:r>
+        <w:rPr>
+          <w:sz w:val="28"/>
+          <w:szCs w:val="28"/>
+          <w:lang w:bidi="ar-EG"/>
+        </w:rPr>
+        <w:t>Environmental awareness for hearing impaired users: Visual alerts, captions, or vibration notifications for events or sounds in the surroundings, such as approaching vehicles or alarms.</w:t>
+      </w:r>
+    </w:p>
+    <w:p>
+      <w:pPr>
+        <w:rPr>
+          <w:sz w:val="28"/>
+          <w:szCs w:val="28"/>
+          <w:lang w:bidi="ar-EG"/>
+        </w:rPr>
+      </w:pPr>
+      <w:r>
+        <w:rPr>
+          <w:sz w:val="28"/>
+          <w:szCs w:val="28"/>
+          <w:lang w:bidi="ar-EG"/>
+        </w:rPr>
+        <w:t>Communication support for speech impaired users: Interfaces that convert typed or gesture-based inputs into spoken messages, enabling real-time interaction with people nearby.</w:t>
+      </w:r>
+    </w:p>
+    <w:p>
+      <w:pPr>
+        <w:rPr>
+          <w:sz w:val="28"/>
+          <w:szCs w:val="28"/>
+          <w:lang w:bidi="ar-EG"/>
+        </w:rPr>
+      </w:pPr>
+      <w:r>
+        <w:rPr>
+          <w:sz w:val="28"/>
+          <w:szCs w:val="28"/>
+          <w:lang w:bidi="ar-EG"/>
+        </w:rPr>
+        <w:t>Multi-modal feedback: Combines audio, visual, and haptic feedback according to the user’s needs.</w:t>
+      </w:r>
+    </w:p>
+    <w:p>
+      <w:pPr>
+        <w:rPr>
+          <w:sz w:val="28"/>
+          <w:szCs w:val="28"/>
+          <w:lang w:bidi="ar-EG"/>
+        </w:rPr>
+      </w:pPr>
+      <w:r>
+        <w:rPr>
+          <w:sz w:val="28"/>
+          <w:szCs w:val="28"/>
+          <w:lang w:bidi="ar-EG"/>
+        </w:rPr>
+        <w:t>Mobility and independence enhancement: Provides real-time, actionable guidance to navigate safely in streets, public spaces, or crowded environments.</w:t>
+      </w:r>
+    </w:p>
+    <w:p>
+      <w:pPr>
+        <w:rPr>
+          <w:sz w:val="28"/>
+          <w:szCs w:val="28"/>
+          <w:lang w:bidi="ar-EG"/>
+        </w:rPr>
+      </w:pPr>
+    </w:p>
+    <w:p>
+      <w:pPr>
+        <w:rPr>
+          <w:b/>
+          <w:bCs/>
+          <w:sz w:val="32"/>
+          <w:szCs w:val="32"/>
+          <w:lang w:bidi="ar-EG"/>
+        </w:rPr>
+      </w:pPr>
+      <w:r>
+        <w:rPr>
+          <w:b/>
+          <w:bCs/>
+          <w:sz w:val="32"/>
+          <w:szCs w:val="32"/>
+          <w:lang w:bidi="ar-EG"/>
+        </w:rPr>
+        <w:t xml:space="preserve">1.3 </w:t>
+      </w:r>
+      <w:r>
+        <w:rPr>
+          <w:b/>
+          <w:bCs/>
+          <w:sz w:val="32"/>
+          <w:szCs w:val="32"/>
+          <w:lang w:bidi="ar-EG"/>
+        </w:rPr>
+        <w:t>System Objectives:</w:t>
+      </w:r>
+    </w:p>
+    <w:p>
+      <w:pPr>
+        <w:rPr>
+          <w:b/>
+          <w:bCs/>
+          <w:sz w:val="28"/>
+          <w:szCs w:val="28"/>
+          <w:lang w:bidi="ar-EG"/>
+        </w:rPr>
+      </w:pPr>
+      <w:r>
+        <w:rPr>
+          <w:b/>
+          <w:bCs/>
+          <w:sz w:val="28"/>
+          <w:szCs w:val="28"/>
+          <w:lang w:bidi="ar-EG"/>
+        </w:rPr>
+        <w:t>1.3.1</w:t>
+      </w:r>
+      <w:r>
+        <w:rPr>
+          <w:b/>
+          <w:bCs/>
+          <w:sz w:val="28"/>
+          <w:szCs w:val="28"/>
+          <w:lang w:bidi="ar-EG"/>
+        </w:rPr>
+        <w:t>Primary Objectives:</w:t>
+      </w:r>
+    </w:p>
+    <w:p>
+      <w:pPr>
+        <w:rPr>
+          <w:sz w:val="28"/>
+          <w:szCs w:val="28"/>
+          <w:lang w:bidi="ar-EG"/>
+        </w:rPr>
+      </w:pPr>
+    </w:p>
+    <w:p>
+      <w:pPr>
+        <w:rPr>
+          <w:sz w:val="28"/>
+          <w:szCs w:val="28"/>
+          <w:lang w:bidi="ar-EG"/>
+        </w:rPr>
+      </w:pPr>
+      <w:r>
+        <w:rPr>
+          <w:sz w:val="28"/>
+          <w:szCs w:val="28"/>
+          <w:lang w:bidi="ar-EG"/>
+        </w:rPr>
+        <w:t xml:space="preserve">Empower users with visual, hearing, and speech impairments to navigate and </w:t>
+      </w:r>
+      <w:r>
+        <w:rPr>
+          <w:sz w:val="28"/>
+          <w:szCs w:val="28"/>
+          <w:lang w:bidi="ar-EG"/>
+        </w:rPr>
+        <w:t xml:space="preserve">          </w:t>
+      </w:r>
+      <w:r>
+        <w:rPr>
+          <w:sz w:val="28"/>
+          <w:szCs w:val="28"/>
+          <w:lang w:bidi="ar-EG"/>
+        </w:rPr>
+        <w:t>interact safely within their physical surroundings.</w:t>
+      </w:r>
+      <w:r>
+        <w:rPr>
+          <w:sz w:val="28"/>
+          <w:szCs w:val="28"/>
+          <w:lang w:bidi="ar-EG"/>
+        </w:rPr>
+        <w:t xml:space="preserve"> </w:t>
+      </w:r>
+      <w:r>
+        <w:rPr>
+          <w:sz w:val="28"/>
+          <w:szCs w:val="28"/>
+          <w:lang w:bidi="ar-EG"/>
+        </w:rPr>
+        <w:t xml:space="preserve">Deliver instant, real-time alerts and guidance to help users avoid </w:t>
+      </w:r>
+      <w:proofErr w:type="gramStart"/>
+      <w:r>
+        <w:rPr>
+          <w:sz w:val="28"/>
+          <w:szCs w:val="28"/>
+          <w:lang w:bidi="ar-EG"/>
+        </w:rPr>
+        <w:t xml:space="preserve">obstacles, </w:t>
+      </w:r>
+      <w:r>
+        <w:rPr>
+          <w:sz w:val="28"/>
+          <w:szCs w:val="28"/>
+          <w:lang w:bidi="ar-EG"/>
+        </w:rPr>
+        <w:t xml:space="preserve"> </w:t>
+      </w:r>
+      <w:r>
+        <w:rPr>
+          <w:sz w:val="28"/>
+          <w:szCs w:val="28"/>
+          <w:lang w:bidi="ar-EG"/>
+        </w:rPr>
+        <w:t>hazards</w:t>
+      </w:r>
+      <w:proofErr w:type="gramEnd"/>
+      <w:r>
+        <w:rPr>
+          <w:sz w:val="28"/>
+          <w:szCs w:val="28"/>
+          <w:lang w:bidi="ar-EG"/>
+        </w:rPr>
+        <w:t>, and unsafe situations.</w:t>
+      </w:r>
+    </w:p>
+    <w:p>
+      <w:pPr>
+        <w:rPr>
+          <w:sz w:val="28"/>
+          <w:szCs w:val="28"/>
+          <w:lang w:bidi="ar-EG"/>
+        </w:rPr>
+      </w:pPr>
+      <w:r>
+        <w:rPr>
+          <w:sz w:val="28"/>
+          <w:szCs w:val="28"/>
+          <w:lang w:bidi="ar-EG"/>
+        </w:rPr>
+        <w:t>Enhance human-to-human interaction by providing adaptive communication tools suitable for different types of impairments.</w:t>
+      </w:r>
+    </w:p>
+    <w:p>
+      <w:pPr>
+        <w:rPr>
+          <w:sz w:val="28"/>
+          <w:szCs w:val="28"/>
+          <w:lang w:bidi="ar-EG"/>
+        </w:rPr>
+      </w:pPr>
+      <w:r>
+        <w:rPr>
+          <w:sz w:val="28"/>
+          <w:szCs w:val="28"/>
+          <w:lang w:bidi="ar-EG"/>
+        </w:rPr>
         <w:lastRenderedPageBreak/>
-        <w:t xml:space="preserve">Visual guidance for the visually impaired: Cameras and sensors </w:t>
-      </w:r>
-      <w:proofErr w:type="gramStart"/>
-      <w:r>
-        <w:rPr>
-          <w:sz w:val="28"/>
-          <w:szCs w:val="28"/>
-          <w:lang w:bidi="ar-EG"/>
-        </w:rPr>
-        <w:t>detect</w:t>
-      </w:r>
-      <w:proofErr w:type="gramEnd"/>
-      <w:r>
-        <w:rPr>
-          <w:sz w:val="28"/>
-          <w:szCs w:val="28"/>
-          <w:lang w:bidi="ar-EG"/>
-        </w:rPr>
-        <w:t xml:space="preserve"> obstacles, directional cues, and important environmental features, providing audio alerts and instructions such as “move forward,” “obstacle ahead,” or “turn left.”</w:t>
-      </w:r>
-    </w:p>
-    <w:p>
-      <w:pPr>
-        <w:rPr>
-          <w:sz w:val="28"/>
-          <w:szCs w:val="28"/>
-          <w:lang w:bidi="ar-EG"/>
-        </w:rPr>
-      </w:pPr>
-      <w:r>
-        <w:rPr>
-          <w:sz w:val="28"/>
-          <w:szCs w:val="28"/>
-          <w:lang w:bidi="ar-EG"/>
-        </w:rPr>
-        <w:t>Environmental awareness for hearing impaired users: Visual alerts, captions, or vibration notifications for events or sounds in the surroundings, such as approaching vehicles or alarms.</w:t>
-      </w:r>
-    </w:p>
-    <w:p>
-      <w:pPr>
-        <w:rPr>
-          <w:sz w:val="28"/>
-          <w:szCs w:val="28"/>
-          <w:lang w:bidi="ar-EG"/>
-        </w:rPr>
-      </w:pPr>
-      <w:r>
-        <w:rPr>
-          <w:sz w:val="28"/>
-          <w:szCs w:val="28"/>
-          <w:lang w:bidi="ar-EG"/>
-        </w:rPr>
-        <w:t>Communication support for speech impaired users: Interfaces that convert typed or gesture-based inputs into spoken messages, enabling real-time interaction with people nearby.</w:t>
-      </w:r>
-    </w:p>
-    <w:p>
-      <w:pPr>
-        <w:rPr>
-          <w:sz w:val="28"/>
-          <w:szCs w:val="28"/>
-          <w:lang w:bidi="ar-EG"/>
-        </w:rPr>
-      </w:pPr>
-      <w:r>
-        <w:rPr>
-          <w:sz w:val="28"/>
-          <w:szCs w:val="28"/>
-          <w:lang w:bidi="ar-EG"/>
-        </w:rPr>
-        <w:t>Multi-modal feedback: Combines audio, visual, and haptic feedback according to the user’s needs.</w:t>
-      </w:r>
-    </w:p>
-    <w:p>
-      <w:pPr>
-        <w:rPr>
-          <w:sz w:val="28"/>
-          <w:szCs w:val="28"/>
-          <w:lang w:bidi="ar-EG"/>
-        </w:rPr>
-      </w:pPr>
-      <w:r>
-        <w:rPr>
-          <w:sz w:val="28"/>
-          <w:szCs w:val="28"/>
-          <w:lang w:bidi="ar-EG"/>
-        </w:rPr>
-        <w:t>Mobility and independence enhancement: Provides real-time, actionable guidance to navigate safely in streets, public spaces, or crowded environments.</w:t>
-      </w:r>
-    </w:p>
-    <w:p>
-      <w:pPr>
-        <w:rPr>
-          <w:sz w:val="28"/>
-          <w:szCs w:val="28"/>
-          <w:lang w:bidi="ar-EG"/>
-        </w:rPr>
-      </w:pPr>
-    </w:p>
-    <w:p>
-      <w:pPr>
-        <w:rPr>
-          <w:b/>
-          <w:bCs/>
-          <w:sz w:val="32"/>
-          <w:szCs w:val="32"/>
-          <w:lang w:bidi="ar-EG"/>
-        </w:rPr>
-      </w:pPr>
-      <w:r>
-        <w:rPr>
-          <w:b/>
-          <w:bCs/>
-          <w:sz w:val="32"/>
-          <w:szCs w:val="32"/>
-          <w:lang w:bidi="ar-EG"/>
-        </w:rPr>
-        <w:t xml:space="preserve">1.3 </w:t>
-      </w:r>
-      <w:r>
-        <w:rPr>
-          <w:b/>
-          <w:bCs/>
-          <w:sz w:val="32"/>
-          <w:szCs w:val="32"/>
-          <w:lang w:bidi="ar-EG"/>
-        </w:rPr>
-        <w:t>System Objectives:</w:t>
-      </w:r>
-    </w:p>
-    <w:p>
-      <w:pPr>
-        <w:rPr>
-          <w:b/>
-          <w:bCs/>
-          <w:sz w:val="28"/>
-          <w:szCs w:val="28"/>
-          <w:lang w:bidi="ar-EG"/>
-        </w:rPr>
-      </w:pPr>
-      <w:r>
-        <w:rPr>
-          <w:b/>
-          <w:bCs/>
-          <w:sz w:val="28"/>
-          <w:szCs w:val="28"/>
-          <w:lang w:bidi="ar-EG"/>
-        </w:rPr>
-        <w:t>1.3.1</w:t>
-      </w:r>
-      <w:r>
-        <w:rPr>
-          <w:b/>
-          <w:bCs/>
-          <w:sz w:val="28"/>
-          <w:szCs w:val="28"/>
-          <w:lang w:bidi="ar-EG"/>
-        </w:rPr>
-        <w:t>Primary Objectives:</w:t>
-      </w:r>
-    </w:p>
-    <w:p>
-      <w:pPr>
-        <w:rPr>
-          <w:sz w:val="28"/>
-          <w:szCs w:val="28"/>
-          <w:lang w:bidi="ar-EG"/>
-        </w:rPr>
-      </w:pPr>
-    </w:p>
-    <w:p>
-      <w:pPr>
-        <w:rPr>
-          <w:sz w:val="28"/>
-          <w:szCs w:val="28"/>
-          <w:lang w:bidi="ar-EG"/>
-        </w:rPr>
-      </w:pPr>
-      <w:r>
-        <w:rPr>
-          <w:sz w:val="28"/>
-          <w:szCs w:val="28"/>
-          <w:lang w:bidi="ar-EG"/>
-        </w:rPr>
-        <w:t xml:space="preserve">Empower users with visual, hearing, and speech impairments to navigate and </w:t>
-      </w:r>
-      <w:r>
-        <w:rPr>
-          <w:sz w:val="28"/>
-          <w:szCs w:val="28"/>
-          <w:lang w:bidi="ar-EG"/>
-        </w:rPr>
-        <w:t xml:space="preserve">          </w:t>
-      </w:r>
-      <w:r>
-        <w:rPr>
-          <w:sz w:val="28"/>
-          <w:szCs w:val="28"/>
-          <w:lang w:bidi="ar-EG"/>
-        </w:rPr>
-        <w:t>interact safely within their physical surroundings.</w:t>
-      </w:r>
-      <w:r>
-        <w:rPr>
-          <w:sz w:val="28"/>
-          <w:szCs w:val="28"/>
-          <w:lang w:bidi="ar-EG"/>
-        </w:rPr>
-        <w:t xml:space="preserve"> </w:t>
-      </w:r>
-      <w:r>
-        <w:rPr>
-          <w:sz w:val="28"/>
-          <w:szCs w:val="28"/>
-          <w:lang w:bidi="ar-EG"/>
-        </w:rPr>
-        <w:t xml:space="preserve">Deliver instant, real-time alerts and guidance to help users avoid </w:t>
-      </w:r>
-      <w:proofErr w:type="gramStart"/>
-      <w:r>
-        <w:rPr>
-          <w:sz w:val="28"/>
-          <w:szCs w:val="28"/>
-          <w:lang w:bidi="ar-EG"/>
-        </w:rPr>
-        <w:t xml:space="preserve">obstacles, </w:t>
-      </w:r>
-      <w:r>
-        <w:rPr>
-          <w:sz w:val="28"/>
-          <w:szCs w:val="28"/>
-          <w:lang w:bidi="ar-EG"/>
-        </w:rPr>
-        <w:t xml:space="preserve"> </w:t>
-      </w:r>
-      <w:r>
-        <w:rPr>
-          <w:sz w:val="28"/>
-          <w:szCs w:val="28"/>
-          <w:lang w:bidi="ar-EG"/>
-        </w:rPr>
-        <w:t>hazards</w:t>
-      </w:r>
-      <w:proofErr w:type="gramEnd"/>
-      <w:r>
-        <w:rPr>
-          <w:sz w:val="28"/>
-          <w:szCs w:val="28"/>
-          <w:lang w:bidi="ar-EG"/>
-        </w:rPr>
-        <w:t>, and unsafe situations.</w:t>
-      </w:r>
-    </w:p>
-    <w:p>
-      <w:pPr>
-        <w:rPr>
-          <w:sz w:val="28"/>
-          <w:szCs w:val="28"/>
-          <w:lang w:bidi="ar-EG"/>
-        </w:rPr>
-      </w:pPr>
-      <w:r>
-        <w:rPr>
-          <w:sz w:val="28"/>
-          <w:szCs w:val="28"/>
-          <w:lang w:bidi="ar-EG"/>
-        </w:rPr>
-        <w:t>Enhance human-to-human interaction by providing adaptive communication tools suitable for different types of impairments.</w:t>
-      </w:r>
-    </w:p>
-    <w:p>
-      <w:pPr>
-        <w:rPr>
-          <w:sz w:val="28"/>
-          <w:szCs w:val="28"/>
-          <w:lang w:bidi="ar-EG"/>
-        </w:rPr>
-      </w:pPr>
-      <w:r>
-        <w:rPr>
-          <w:sz w:val="28"/>
-          <w:szCs w:val="28"/>
-          <w:lang w:bidi="ar-EG"/>
-        </w:rPr>
         <w:t>Implement a multi-modal feedback system, including audio, visual, and haptic signals, tailored to each individual’s accessibility needs.</w:t>
       </w:r>
     </w:p>
@@ -2717,7 +2718,6 @@
           <w:szCs w:val="28"/>
           <w:lang w:bidi="ar-EG"/>
         </w:rPr>
-        <w:lastRenderedPageBreak/>
         <w:t xml:space="preserve">1.3.2 </w:t>
       </w:r>
       <w:r>
@@ -3225,189 +3225,428 @@
           <w:szCs w:val="32"/>
           <w:lang w:bidi="ar-EG"/>
         </w:rPr>
+        <w:t>2.1 Requirements and Analysis</w:t>
+      </w:r>
+    </w:p>
+    <w:p>
+      <w:pPr>
+        <w:rPr>
+          <w:b/>
+          <w:bCs/>
+          <w:sz w:val="28"/>
+          <w:szCs w:val="28"/>
+          <w:lang w:bidi="ar-EG"/>
+        </w:rPr>
+      </w:pPr>
+      <w:r>
+        <w:rPr>
+          <w:b/>
+          <w:bCs/>
+          <w:lang w:bidi="ar-EG"/>
+        </w:rPr>
+        <w:t xml:space="preserve">  </w:t>
+      </w:r>
+      <w:r>
+        <w:rPr>
+          <w:b/>
+          <w:bCs/>
+          <w:sz w:val="28"/>
+          <w:szCs w:val="28"/>
+          <w:lang w:bidi="ar-EG"/>
+        </w:rPr>
+        <w:t>2.1.1 User requirements</w:t>
+      </w:r>
+    </w:p>
+    <w:p>
+      <w:pPr>
+        <w:rPr>
+          <w:sz w:val="28"/>
+          <w:szCs w:val="28"/>
+          <w:lang w:bidi="ar-EG"/>
+        </w:rPr>
+      </w:pPr>
+      <w:r>
+        <w:rPr>
+          <w:sz w:val="28"/>
+          <w:szCs w:val="28"/>
+          <w:lang w:bidi="ar-EG"/>
+        </w:rPr>
+        <w:t>UR1: Users with disabilities shall interact with the system using accessible methods.</w:t>
+      </w:r>
+    </w:p>
+    <w:p>
+      <w:pPr>
+        <w:rPr>
+          <w:sz w:val="28"/>
+          <w:szCs w:val="28"/>
+          <w:lang w:bidi="ar-EG"/>
+        </w:rPr>
+      </w:pPr>
+      <w:r>
+        <w:rPr>
+          <w:sz w:val="28"/>
+          <w:szCs w:val="28"/>
+          <w:lang w:bidi="ar-EG"/>
+        </w:rPr>
+        <w:t>UR2: Visually impaired users shall receive audio-based interaction.</w:t>
+      </w:r>
+    </w:p>
+    <w:p>
+      <w:pPr>
+        <w:rPr>
+          <w:sz w:val="28"/>
+          <w:szCs w:val="28"/>
+          <w:lang w:bidi="ar-EG"/>
+        </w:rPr>
+      </w:pPr>
+      <w:r>
+        <w:rPr>
+          <w:sz w:val="28"/>
+          <w:szCs w:val="28"/>
+          <w:lang w:bidi="ar-EG"/>
+        </w:rPr>
+        <w:t>UR3: Hearing-impaired users shall receive text and visual interaction.</w:t>
+      </w:r>
+    </w:p>
+    <w:p>
+      <w:pPr>
+        <w:rPr>
+          <w:sz w:val="28"/>
+          <w:szCs w:val="28"/>
+          <w:lang w:bidi="ar-EG"/>
+        </w:rPr>
+      </w:pPr>
+      <w:r>
+        <w:rPr>
+          <w:sz w:val="28"/>
+          <w:szCs w:val="28"/>
+          <w:lang w:bidi="ar-EG"/>
+        </w:rPr>
+        <w:t>UR4: Speech-impaired users shall be able to use touch or typing to communicate.</w:t>
+      </w:r>
+    </w:p>
+    <w:p>
+      <w:pPr>
+        <w:rPr>
+          <w:sz w:val="28"/>
+          <w:szCs w:val="28"/>
+          <w:lang w:bidi="ar-EG"/>
+        </w:rPr>
+      </w:pPr>
+      <w:r>
+        <w:rPr>
+          <w:sz w:val="28"/>
+          <w:szCs w:val="28"/>
+          <w:lang w:bidi="ar-EG"/>
+        </w:rPr>
+        <w:t>UR5: All users shall be able to adjust accessibility settings according to their needs.</w:t>
+      </w:r>
+    </w:p>
+    <w:p>
+      <w:pPr>
+        <w:rPr>
+          <w:sz w:val="28"/>
+          <w:szCs w:val="28"/>
+          <w:lang w:bidi="ar-EG"/>
+        </w:rPr>
+      </w:pPr>
+      <w:r>
+        <w:rPr>
+          <w:sz w:val="28"/>
+          <w:szCs w:val="28"/>
+          <w:lang w:bidi="ar-EG"/>
+        </w:rPr>
+        <w:t>UR6: Users shall be able to access system features without requiring special training.</w:t>
+      </w:r>
+    </w:p>
+    <w:p>
+      <w:pPr>
+        <w:rPr>
+          <w:b/>
+          <w:bCs/>
+          <w:sz w:val="32"/>
+          <w:szCs w:val="32"/>
+          <w:lang w:bidi="ar-EG"/>
+        </w:rPr>
+      </w:pPr>
+    </w:p>
+    <w:p>
+      <w:pPr>
+        <w:rPr>
+          <w:b/>
+          <w:bCs/>
+          <w:sz w:val="28"/>
+          <w:szCs w:val="28"/>
+          <w:lang w:bidi="ar-EG"/>
+        </w:rPr>
+      </w:pPr>
+      <w:r>
+        <w:rPr>
+          <w:b/>
+          <w:bCs/>
+          <w:sz w:val="28"/>
+          <w:szCs w:val="28"/>
+          <w:lang w:bidi="ar-EG"/>
+        </w:rPr>
+        <w:t xml:space="preserve">  2.1.2 Software requirements:</w:t>
+      </w:r>
+    </w:p>
+    <w:p>
+      <w:pPr>
+        <w:rPr>
+          <w:b/>
+          <w:bCs/>
+        </w:rPr>
+      </w:pPr>
+      <w:r>
+        <w:rPr>
+          <w:b/>
+          <w:bCs/>
+          <w:sz w:val="32"/>
+          <w:szCs w:val="32"/>
+          <w:lang w:bidi="ar-EG"/>
+        </w:rPr>
+        <w:t xml:space="preserve">  </w:t>
+      </w:r>
+      <w:r>
+        <w:rPr>
+          <w:b/>
+          <w:bCs/>
+          <w:lang w:bidi="ar-EG"/>
+        </w:rPr>
+        <w:t xml:space="preserve"> </w:t>
+      </w:r>
+      <w:r>
+        <w:rPr>
+          <w:b/>
+          <w:bCs/>
+          <w:u w:val="single"/>
+          <w:lang w:bidi="ar-EG"/>
+        </w:rPr>
+        <w:t xml:space="preserve"> 2.1.2.1 Functional </w:t>
+      </w:r>
+      <w:r>
+        <w:rPr>
+          <w:b/>
+          <w:bCs/>
+          <w:u w:val="single"/>
+          <w:lang w:bidi="ar-EG"/>
+        </w:rPr>
+        <w:t>requirements</w:t>
+      </w:r>
+      <w:r>
+        <w:rPr>
+          <w:b/>
+          <w:bCs/>
+          <w:lang w:bidi="ar-EG"/>
+        </w:rPr>
+        <w:t>:</w:t>
+      </w:r>
+      <w:r>
+        <w:rPr>
+          <w:b/>
+          <w:bCs/>
+        </w:rPr>
+        <w:t xml:space="preserve"> What</w:t>
+      </w:r>
+      <w:r>
+        <w:rPr>
+          <w:b/>
+          <w:bCs/>
+        </w:rPr>
+        <w:t xml:space="preserve"> the system must do.</w:t>
+      </w:r>
+    </w:p>
+    <w:p>
+      <w:pPr>
+        <w:ind w:leftChars="200" w:left="600" w:hangingChars="50" w:hanging="120"/>
+        <w:rPr>
+          <w:b/>
+          <w:bCs/>
+        </w:rPr>
+      </w:pPr>
+      <w:r>
+        <w:rPr>
+          <w:b/>
+          <w:bCs/>
+        </w:rPr>
+        <w:t>1-User Accounts &amp; Login: Users can create accounts, log in securely, and recover passwords if needed.</w:t>
+      </w:r>
+    </w:p>
+    <w:p>
+      <w:pPr>
+        <w:ind w:leftChars="200" w:left="600" w:hangingChars="50" w:hanging="120"/>
+        <w:rPr>
+          <w:b/>
+          <w:bCs/>
+        </w:rPr>
+      </w:pPr>
+      <w:r>
+        <w:rPr>
+          <w:b/>
+          <w:bCs/>
+        </w:rPr>
+        <w:t>2-User Profile (Disability Information): Users can save their disability type, communication preferences, and other personal details.</w:t>
+      </w:r>
+    </w:p>
+    <w:p>
+      <w:pPr>
+        <w:ind w:leftChars="200" w:left="600" w:hangingChars="50" w:hanging="120"/>
+        <w:rPr>
+          <w:b/>
+          <w:bCs/>
+        </w:rPr>
+      </w:pPr>
+      <w:r>
+        <w:rPr>
+          <w:b/>
+          <w:bCs/>
+        </w:rPr>
+        <w:t>3-Accessible Communication: Users can send text messages, voice messages, and make video calls.</w:t>
+      </w:r>
+    </w:p>
+    <w:p>
+      <w:pPr>
+        <w:ind w:leftChars="200" w:left="600" w:hangingChars="50" w:hanging="120"/>
+        <w:rPr>
+          <w:b/>
+          <w:bCs/>
+        </w:rPr>
+      </w:pPr>
+      <w:r>
+        <w:rPr>
+          <w:b/>
+          <w:bCs/>
+        </w:rPr>
         <w:lastRenderedPageBreak/>
-        <w:t>2.1 Requirements and Analysis</w:t>
-      </w:r>
-    </w:p>
-    <w:p>
-      <w:pPr>
-        <w:rPr>
-          <w:b/>
-          <w:bCs/>
-          <w:sz w:val="28"/>
-          <w:szCs w:val="28"/>
-          <w:lang w:bidi="ar-EG"/>
-        </w:rPr>
-      </w:pPr>
-      <w:r>
-        <w:rPr>
-          <w:b/>
-          <w:bCs/>
-          <w:lang w:bidi="ar-EG"/>
-        </w:rPr>
-        <w:t xml:space="preserve">  </w:t>
-      </w:r>
-      <w:r>
-        <w:rPr>
-          <w:b/>
-          <w:bCs/>
-          <w:sz w:val="28"/>
-          <w:szCs w:val="28"/>
-          <w:lang w:bidi="ar-EG"/>
-        </w:rPr>
-        <w:t>2.1.1 User requirements</w:t>
-      </w:r>
-    </w:p>
-    <w:p>
-      <w:pPr>
-        <w:rPr>
-          <w:sz w:val="28"/>
-          <w:szCs w:val="28"/>
-          <w:lang w:bidi="ar-EG"/>
-        </w:rPr>
-      </w:pPr>
-      <w:r>
-        <w:rPr>
-          <w:sz w:val="28"/>
-          <w:szCs w:val="28"/>
-          <w:lang w:bidi="ar-EG"/>
-        </w:rPr>
-        <w:t>UR1: Users with disabilities shall interact with the system using accessible methods.</w:t>
-      </w:r>
-    </w:p>
-    <w:p>
-      <w:pPr>
-        <w:rPr>
-          <w:sz w:val="28"/>
-          <w:szCs w:val="28"/>
-          <w:lang w:bidi="ar-EG"/>
-        </w:rPr>
-      </w:pPr>
-      <w:r>
-        <w:rPr>
-          <w:sz w:val="28"/>
-          <w:szCs w:val="28"/>
-          <w:lang w:bidi="ar-EG"/>
-        </w:rPr>
-        <w:t>UR2: Visually impaired users shall receive audio-based interaction.</w:t>
-      </w:r>
-    </w:p>
-    <w:p>
-      <w:pPr>
-        <w:rPr>
-          <w:sz w:val="28"/>
-          <w:szCs w:val="28"/>
-          <w:lang w:bidi="ar-EG"/>
-        </w:rPr>
-      </w:pPr>
-      <w:r>
-        <w:rPr>
-          <w:sz w:val="28"/>
-          <w:szCs w:val="28"/>
-          <w:lang w:bidi="ar-EG"/>
-        </w:rPr>
-        <w:t>UR3: Hearing-impaired users shall receive text and visual interaction.</w:t>
-      </w:r>
-    </w:p>
-    <w:p>
-      <w:pPr>
-        <w:rPr>
-          <w:sz w:val="28"/>
-          <w:szCs w:val="28"/>
-          <w:lang w:bidi="ar-EG"/>
-        </w:rPr>
-      </w:pPr>
-      <w:r>
-        <w:rPr>
-          <w:sz w:val="28"/>
-          <w:szCs w:val="28"/>
-          <w:lang w:bidi="ar-EG"/>
-        </w:rPr>
-        <w:t>UR4: Speech-impaired users shall be able to use touch or typing to communicate.</w:t>
-      </w:r>
-    </w:p>
-    <w:p>
-      <w:pPr>
-        <w:rPr>
-          <w:sz w:val="28"/>
-          <w:szCs w:val="28"/>
-          <w:lang w:bidi="ar-EG"/>
-        </w:rPr>
-      </w:pPr>
-      <w:r>
-        <w:rPr>
-          <w:sz w:val="28"/>
-          <w:szCs w:val="28"/>
-          <w:lang w:bidi="ar-EG"/>
-        </w:rPr>
-        <w:t>UR5: All users shall be able to adjust accessibility settings according to their needs.</w:t>
-      </w:r>
-    </w:p>
-    <w:p>
-      <w:pPr>
-        <w:rPr>
-          <w:sz w:val="28"/>
-          <w:szCs w:val="28"/>
-          <w:lang w:bidi="ar-EG"/>
-        </w:rPr>
-      </w:pPr>
-      <w:r>
-        <w:rPr>
-          <w:sz w:val="28"/>
-          <w:szCs w:val="28"/>
-          <w:lang w:bidi="ar-EG"/>
-        </w:rPr>
-        <w:t>UR6: Users shall be able to access system features without requiring special training.</w:t>
-      </w:r>
-    </w:p>
-    <w:p>
-      <w:pPr>
-        <w:rPr>
-          <w:b/>
-          <w:bCs/>
-          <w:sz w:val="32"/>
-          <w:szCs w:val="32"/>
-          <w:lang w:bidi="ar-EG"/>
-        </w:rPr>
-      </w:pPr>
-    </w:p>
-    <w:p>
-      <w:pPr>
-        <w:rPr>
-          <w:b/>
-          <w:bCs/>
-          <w:sz w:val="28"/>
-          <w:szCs w:val="28"/>
-          <w:lang w:bidi="ar-EG"/>
-        </w:rPr>
-      </w:pPr>
-      <w:r>
-        <w:rPr>
-          <w:b/>
-          <w:bCs/>
-          <w:sz w:val="28"/>
-          <w:szCs w:val="28"/>
-          <w:lang w:bidi="ar-EG"/>
-        </w:rPr>
-        <w:t xml:space="preserve">  2.1.2 Software requirements:</w:t>
-      </w:r>
-    </w:p>
-    <w:p>
-      <w:pPr>
-        <w:rPr>
-          <w:b/>
-          <w:bCs/>
-        </w:rPr>
-      </w:pPr>
-      <w:r>
-        <w:rPr>
-          <w:b/>
-          <w:bCs/>
-          <w:sz w:val="32"/>
-          <w:szCs w:val="32"/>
-          <w:lang w:bidi="ar-EG"/>
-        </w:rPr>
-        <w:t xml:space="preserve">  </w:t>
+        <w:t>4-Assistive Communication Tools: Real-time captions, speech-to-text, and text-to-speech for better communication.</w:t>
+      </w:r>
+    </w:p>
+    <w:p>
+      <w:pPr>
+        <w:ind w:firstLineChars="200" w:firstLine="482"/>
+        <w:rPr>
+          <w:b/>
+          <w:bCs/>
+        </w:rPr>
+      </w:pPr>
+      <w:r>
+        <w:rPr>
+          <w:b/>
+          <w:bCs/>
+        </w:rPr>
+        <w:t>5-Sign-Language Support: Video option for users who use sign language.</w:t>
+      </w:r>
+    </w:p>
+    <w:p>
+      <w:pPr>
+        <w:ind w:leftChars="200" w:left="600" w:hangingChars="50" w:hanging="120"/>
+        <w:rPr>
+          <w:b/>
+          <w:bCs/>
+        </w:rPr>
+      </w:pPr>
+      <w:r>
+        <w:rPr>
+          <w:b/>
+          <w:bCs/>
+        </w:rPr>
+        <w:t>6-Emergency Contact: One-tap SOS button sends alerts and location to caregivers or authorities.</w:t>
+      </w:r>
+    </w:p>
+    <w:p>
+      <w:pPr>
+        <w:ind w:leftChars="200" w:left="600" w:hangingChars="50" w:hanging="120"/>
+        <w:rPr>
+          <w:b/>
+          <w:bCs/>
+        </w:rPr>
+      </w:pPr>
+      <w:r>
+        <w:rPr>
+          <w:b/>
+          <w:bCs/>
+        </w:rPr>
+        <w:t>7-Contacts &amp; Social Connection: Users can add friends, family, or caregivers and communicate easily.</w:t>
+      </w:r>
+    </w:p>
+    <w:p>
+      <w:pPr>
+        <w:ind w:firstLineChars="150" w:firstLine="361"/>
+        <w:rPr>
+          <w:b/>
+          <w:bCs/>
+        </w:rPr>
+      </w:pPr>
+      <w:r>
+        <w:rPr>
+          <w:b/>
+          <w:bCs/>
+        </w:rPr>
+        <w:t>8-Notifications: Alerts for new messages, requests, or emergency responses.</w:t>
+      </w:r>
+    </w:p>
+    <w:p>
+      <w:pPr>
+        <w:ind w:leftChars="200" w:left="480"/>
+        <w:rPr>
+          <w:b/>
+          <w:bCs/>
+          <w:lang w:bidi="ar-EG"/>
+        </w:rPr>
+      </w:pPr>
+      <w:r>
+        <w:rPr>
+          <w:b/>
+          <w:bCs/>
+        </w:rPr>
+        <w:t>9-Accessibility Settings: Users can adjust text size, colors, audio settings, and use a simplified interface.</w:t>
+      </w:r>
+    </w:p>
+    <w:p>
+      <w:pPr>
+        <w:rPr>
+          <w:b/>
+          <w:bCs/>
+          <w:sz w:val="32"/>
+          <w:szCs w:val="32"/>
+          <w:lang w:bidi="ar-EG"/>
+        </w:rPr>
+      </w:pPr>
+      <w:r>
+        <w:rPr>
+          <w:b/>
+          <w:bCs/>
+          <w:sz w:val="32"/>
+          <w:szCs w:val="32"/>
+          <w:lang w:bidi="ar-EG"/>
+        </w:rPr>
+        <w:t xml:space="preserve">   </w:t>
+      </w:r>
+    </w:p>
+    <w:p>
+      <w:pPr>
+        <w:rPr>
+          <w:b/>
+          <w:bCs/>
+        </w:rPr>
+      </w:pPr>
+      <w:r>
+        <w:rPr>
+          <w:b/>
+          <w:bCs/>
+          <w:lang w:bidi="ar-EG"/>
+        </w:rPr>
+        <w:t xml:space="preserve">   </w:t>
+      </w:r>
+      <w:r>
+        <w:rPr>
+          <w:b/>
+          <w:bCs/>
+          <w:u w:val="single"/>
+          <w:lang w:bidi="ar-EG"/>
+        </w:rPr>
+        <w:t xml:space="preserve"> 2.1.2.2 Non-functional requirements:</w:t>
       </w:r>
       <w:r>
         <w:rPr>
@@ -3421,153 +3660,40 @@
         <w:rPr>
           <w:b/>
           <w:bCs/>
-          <w:u w:val="single"/>
-          <w:lang w:bidi="ar-EG"/>
-        </w:rPr>
-        <w:t xml:space="preserve"> 2.1.2.1 Functional </w:t>
-      </w:r>
-      <w:r>
-        <w:rPr>
-          <w:b/>
-          <w:bCs/>
-          <w:u w:val="single"/>
-          <w:lang w:bidi="ar-EG"/>
-        </w:rPr>
-        <w:t>requirements</w:t>
-      </w:r>
-      <w:r>
-        <w:rPr>
-          <w:b/>
-          <w:bCs/>
-          <w:lang w:bidi="ar-EG"/>
-        </w:rPr>
-        <w:t>:</w:t>
-      </w:r>
-      <w:r>
-        <w:rPr>
-          <w:b/>
-          <w:bCs/>
-        </w:rPr>
-        <w:t xml:space="preserve"> What</w:t>
-      </w:r>
-      <w:r>
-        <w:rPr>
-          <w:b/>
-          <w:bCs/>
-        </w:rPr>
-        <w:t xml:space="preserve"> the system must do.</w:t>
-      </w:r>
-    </w:p>
-    <w:p>
-      <w:pPr>
-        <w:ind w:leftChars="200" w:left="600" w:hangingChars="50" w:hanging="120"/>
-        <w:rPr>
-          <w:b/>
-          <w:bCs/>
-        </w:rPr>
-      </w:pPr>
-      <w:r>
-        <w:rPr>
-          <w:b/>
-          <w:bCs/>
-        </w:rPr>
-        <w:t>1-User Accounts &amp; Login: Users can create accounts, log in securely, and recover passwords if needed.</w:t>
-      </w:r>
-    </w:p>
-    <w:p>
-      <w:pPr>
-        <w:ind w:leftChars="200" w:left="600" w:hangingChars="50" w:hanging="120"/>
-        <w:rPr>
-          <w:b/>
-          <w:bCs/>
-        </w:rPr>
-      </w:pPr>
-      <w:r>
-        <w:rPr>
-          <w:b/>
-          <w:bCs/>
-        </w:rPr>
-        <w:t>2-User Profile (Disability Information): Users can save their disability type, communication preferences, and other personal details.</w:t>
-      </w:r>
-    </w:p>
-    <w:p>
-      <w:pPr>
-        <w:ind w:leftChars="200" w:left="600" w:hangingChars="50" w:hanging="120"/>
-        <w:rPr>
-          <w:b/>
-          <w:bCs/>
-        </w:rPr>
-      </w:pPr>
-      <w:r>
-        <w:rPr>
-          <w:b/>
-          <w:bCs/>
-        </w:rPr>
-        <w:t>3-Accessible Communication: Users can send text messages, voice messages, and make video calls.</w:t>
-      </w:r>
-    </w:p>
-    <w:p>
-      <w:pPr>
-        <w:ind w:leftChars="200" w:left="600" w:hangingChars="50" w:hanging="120"/>
-        <w:rPr>
-          <w:b/>
-          <w:bCs/>
-        </w:rPr>
-      </w:pPr>
-      <w:r>
-        <w:rPr>
-          <w:b/>
-          <w:bCs/>
-        </w:rPr>
-        <w:t>4-Assistive Communication Tools: Real-time captions, speech-to-text, and text-to-speech for better communication.</w:t>
-      </w:r>
-    </w:p>
-    <w:p>
-      <w:pPr>
-        <w:ind w:firstLineChars="200" w:firstLine="482"/>
-        <w:rPr>
-          <w:b/>
-          <w:bCs/>
-        </w:rPr>
-      </w:pPr>
-      <w:r>
-        <w:rPr>
-          <w:b/>
-          <w:bCs/>
-        </w:rPr>
-        <w:t>5-Sign-Language Support: Video option for users who use sign language.</w:t>
-      </w:r>
-    </w:p>
-    <w:p>
-      <w:pPr>
-        <w:ind w:leftChars="200" w:left="600" w:hangingChars="50" w:hanging="120"/>
-        <w:rPr>
-          <w:b/>
-          <w:bCs/>
-        </w:rPr>
-      </w:pPr>
-      <w:r>
-        <w:rPr>
-          <w:b/>
-          <w:bCs/>
-        </w:rPr>
-        <w:t>6-Emergency Contact: One-tap SOS button sends alerts and location to caregivers or authorities.</w:t>
-      </w:r>
-    </w:p>
-    <w:p>
-      <w:pPr>
-        <w:ind w:leftChars="200" w:left="600" w:hangingChars="50" w:hanging="120"/>
-        <w:rPr>
-          <w:b/>
-          <w:bCs/>
-        </w:rPr>
-      </w:pPr>
-      <w:r>
-        <w:rPr>
-          <w:b/>
-          <w:bCs/>
-        </w:rPr>
-        <w:t>7-Contacts &amp; Social Connection: Users can add friends, family, or caregivers and communicate easily.</w:t>
+        </w:rPr>
+        <w:t>Quality standards the system must follow.</w:t>
+      </w:r>
+    </w:p>
+    <w:p>
+      <w:pPr>
+        <w:ind w:leftChars="200" w:left="480"/>
+        <w:rPr>
+          <w:b/>
+          <w:bCs/>
+        </w:rPr>
+      </w:pPr>
+      <w:r>
+        <w:rPr>
+          <w:b/>
+          <w:bCs/>
+        </w:rPr>
+        <w:t>1-Accessibility: Must follow WCAG 2.1 guidelines to ensure all users can access and use the system effectively.</w:t>
+      </w:r>
+    </w:p>
+    <w:p>
+      <w:pPr>
+        <w:ind w:leftChars="200" w:left="480"/>
+        <w:rPr>
+          <w:b/>
+          <w:bCs/>
+        </w:rPr>
+      </w:pPr>
+      <w:r>
+        <w:rPr>
+          <w:b/>
+          <w:bCs/>
+        </w:rPr>
+        <w:t>2-Performance: Messages should load instantly, and video/audio calls should run smoothly with minimal latency.</w:t>
       </w:r>
     </w:p>
     <w:p>
@@ -3583,295 +3709,147 @@
           <w:b/>
           <w:bCs/>
         </w:rPr>
-        <w:t>8-Notifications: Alerts for new messages, requests, or emergency responses.</w:t>
-      </w:r>
-    </w:p>
-    <w:p>
-      <w:pPr>
-        <w:ind w:leftChars="200" w:left="480"/>
-        <w:rPr>
-          <w:b/>
-          <w:bCs/>
-          <w:lang w:bidi="ar-EG"/>
-        </w:rPr>
-      </w:pPr>
-      <w:r>
-        <w:rPr>
-          <w:b/>
-          <w:bCs/>
+        <w:t>3-Security: Data must be encrypted, login secured, and privacy protected.</w:t>
+      </w:r>
+    </w:p>
+    <w:p>
+      <w:pPr>
+        <w:ind w:firstLineChars="100" w:firstLine="241"/>
+        <w:rPr>
+          <w:b/>
+          <w:bCs/>
+        </w:rPr>
+      </w:pPr>
+      <w:r>
+        <w:rPr>
+          <w:b/>
+          <w:bCs/>
+        </w:rPr>
+        <w:t>4-Reliability: System should be available 24/7 with minimal downtime.</w:t>
+      </w:r>
+    </w:p>
+    <w:p>
+      <w:pPr>
+        <w:ind w:leftChars="100" w:left="360" w:hangingChars="50" w:hanging="120"/>
+        <w:rPr>
+          <w:b/>
+          <w:bCs/>
+        </w:rPr>
+      </w:pPr>
+      <w:r>
+        <w:rPr>
+          <w:b/>
+          <w:bCs/>
+        </w:rPr>
+        <w:t>5-Usability: Interface must be simple, intuitive, and easy to navigate for all users.</w:t>
+      </w:r>
+    </w:p>
+    <w:p>
+      <w:pPr>
+        <w:ind w:leftChars="100" w:left="360" w:hangingChars="50" w:hanging="120"/>
+        <w:rPr>
+          <w:b/>
+          <w:bCs/>
+        </w:rPr>
+      </w:pPr>
+      <w:r>
+        <w:rPr>
+          <w:b/>
+          <w:bCs/>
+        </w:rPr>
+        <w:t>6-Scalability: Must support many users communicating simultaneously without slowing down.</w:t>
+      </w:r>
+    </w:p>
+    <w:p>
+      <w:pPr>
+        <w:ind w:leftChars="100" w:left="360" w:hangingChars="50" w:hanging="120"/>
+        <w:rPr>
+          <w:b/>
+          <w:bCs/>
+        </w:rPr>
+      </w:pPr>
+      <w:r>
+        <w:rPr>
+          <w:b/>
+          <w:bCs/>
+        </w:rPr>
+        <w:t>7-Compatibility: Works on mobile phones (iOS &amp; Android), tablets, and desktop computers.</w:t>
+      </w:r>
+    </w:p>
+    <w:p>
+      <w:pPr>
+        <w:ind w:leftChars="100" w:left="360" w:hangingChars="50" w:hanging="120"/>
+        <w:rPr>
+          <w:b/>
+          <w:bCs/>
+        </w:rPr>
+      </w:pPr>
+      <w:r>
+        <w:rPr>
+          <w:b/>
+          <w:bCs/>
+        </w:rPr>
+        <w:t>8-Localization: Supports multiple languages, including Arabic and English, with proper layout for right-to-left text.</w:t>
+      </w:r>
+    </w:p>
+    <w:p>
+      <w:pPr>
+        <w:ind w:leftChars="100" w:left="360" w:hangingChars="50" w:hanging="120"/>
+        <w:rPr>
+          <w:b/>
+          <w:bCs/>
+          <w:lang w:bidi="ar-EG"/>
+        </w:rPr>
+      </w:pPr>
+      <w:r>
+        <w:rPr>
+          <w:b/>
+          <w:bCs/>
+        </w:rPr>
+        <w:t>9-Backup &amp; Recovery: Regular data backup and recovery plan to prevent data loss.</w:t>
+      </w:r>
+    </w:p>
+    <w:p>
+      <w:pPr>
+        <w:rPr>
+          <w:b/>
+          <w:bCs/>
+          <w:sz w:val="32"/>
+          <w:szCs w:val="32"/>
+          <w:lang w:bidi="ar-EG"/>
+        </w:rPr>
+      </w:pPr>
+    </w:p>
+    <w:p>
+      <w:pPr>
+        <w:rPr>
+          <w:b/>
+          <w:bCs/>
+          <w:sz w:val="32"/>
+          <w:szCs w:val="32"/>
+          <w:lang w:bidi="ar-EG"/>
+        </w:rPr>
+      </w:pPr>
+    </w:p>
+    <w:p>
+      <w:pPr>
+        <w:rPr>
+          <w:b/>
+          <w:bCs/>
+          <w:sz w:val="28"/>
+          <w:szCs w:val="28"/>
+          <w:lang w:bidi="ar-EG"/>
+        </w:rPr>
+      </w:pPr>
+      <w:r>
+        <w:rPr>
+          <w:b/>
+          <w:bCs/>
+          <w:sz w:val="28"/>
+          <w:szCs w:val="28"/>
+          <w:lang w:bidi="ar-EG"/>
         </w:rPr>
         <w:lastRenderedPageBreak/>
-        <w:t>9-Accessibility Settings: Users can adjust text size, colors, audio settings, and use a simplified interface.</w:t>
-      </w:r>
-    </w:p>
-    <w:p>
-      <w:pPr>
-        <w:rPr>
-          <w:b/>
-          <w:bCs/>
-          <w:sz w:val="32"/>
-          <w:szCs w:val="32"/>
-          <w:lang w:bidi="ar-EG"/>
-        </w:rPr>
-      </w:pPr>
-      <w:r>
-        <w:rPr>
-          <w:b/>
-          <w:bCs/>
-          <w:sz w:val="32"/>
-          <w:szCs w:val="32"/>
-          <w:lang w:bidi="ar-EG"/>
-        </w:rPr>
-        <w:t xml:space="preserve">   </w:t>
-      </w:r>
-    </w:p>
-    <w:p>
-      <w:pPr>
-        <w:rPr>
-          <w:b/>
-          <w:bCs/>
-        </w:rPr>
-      </w:pPr>
-      <w:r>
-        <w:rPr>
-          <w:b/>
-          <w:bCs/>
-          <w:lang w:bidi="ar-EG"/>
-        </w:rPr>
-        <w:t xml:space="preserve">   </w:t>
-      </w:r>
-      <w:r>
-        <w:rPr>
-          <w:b/>
-          <w:bCs/>
-          <w:u w:val="single"/>
-          <w:lang w:bidi="ar-EG"/>
-        </w:rPr>
-        <w:t xml:space="preserve"> 2.1.2.2 Non-functional requirements:</w:t>
-      </w:r>
-      <w:r>
-        <w:rPr>
-          <w:b/>
-          <w:bCs/>
-          <w:lang w:bidi="ar-EG"/>
-        </w:rPr>
-        <w:t xml:space="preserve"> </w:t>
-      </w:r>
-      <w:r>
-        <w:rPr>
-          <w:b/>
-          <w:bCs/>
-        </w:rPr>
-        <w:t>Quality standards the system must follow.</w:t>
-      </w:r>
-    </w:p>
-    <w:p>
-      <w:pPr>
-        <w:ind w:leftChars="200" w:left="480"/>
-        <w:rPr>
-          <w:b/>
-          <w:bCs/>
-        </w:rPr>
-      </w:pPr>
-      <w:r>
-        <w:rPr>
-          <w:b/>
-          <w:bCs/>
-        </w:rPr>
-        <w:t>1-Accessibility: Must follow WCAG 2.1 guidelines to ensure all users can access and use the system effectively.</w:t>
-      </w:r>
-    </w:p>
-    <w:p>
-      <w:pPr>
-        <w:ind w:leftChars="200" w:left="480"/>
-        <w:rPr>
-          <w:b/>
-          <w:bCs/>
-        </w:rPr>
-      </w:pPr>
-      <w:r>
-        <w:rPr>
-          <w:b/>
-          <w:bCs/>
-        </w:rPr>
-        <w:t>2-Performance: Messages should load instantly, and video/audio calls should run smoothly with minimal latency.</w:t>
-      </w:r>
-    </w:p>
-    <w:p>
-      <w:pPr>
-        <w:ind w:firstLineChars="150" w:firstLine="361"/>
-        <w:rPr>
-          <w:b/>
-          <w:bCs/>
-        </w:rPr>
-      </w:pPr>
-      <w:r>
-        <w:rPr>
-          <w:b/>
-          <w:bCs/>
-        </w:rPr>
-        <w:t>3-Security: Data must be encrypted, login secured, and privacy protected.</w:t>
-      </w:r>
-    </w:p>
-    <w:p>
-      <w:pPr>
-        <w:ind w:firstLineChars="100" w:firstLine="241"/>
-        <w:rPr>
-          <w:b/>
-          <w:bCs/>
-        </w:rPr>
-      </w:pPr>
-      <w:r>
-        <w:rPr>
-          <w:b/>
-          <w:bCs/>
-        </w:rPr>
-        <w:t>4-Reliability: System should be available 24/7 with minimal downtime.</w:t>
-      </w:r>
-    </w:p>
-    <w:p>
-      <w:pPr>
-        <w:ind w:leftChars="100" w:left="360" w:hangingChars="50" w:hanging="120"/>
-        <w:rPr>
-          <w:b/>
-          <w:bCs/>
-        </w:rPr>
-      </w:pPr>
-      <w:r>
-        <w:rPr>
-          <w:b/>
-          <w:bCs/>
-        </w:rPr>
-        <w:t>5-Usability: Interface must be simple, intuitive, and easy to navigate for all users.</w:t>
-      </w:r>
-    </w:p>
-    <w:p>
-      <w:pPr>
-        <w:ind w:leftChars="100" w:left="360" w:hangingChars="50" w:hanging="120"/>
-        <w:rPr>
-          <w:b/>
-          <w:bCs/>
-        </w:rPr>
-      </w:pPr>
-      <w:r>
-        <w:rPr>
-          <w:b/>
-          <w:bCs/>
-        </w:rPr>
-        <w:t>6-Scalability: Must support many users communicating simultaneously without slowing down.</w:t>
-      </w:r>
-    </w:p>
-    <w:p>
-      <w:pPr>
-        <w:ind w:leftChars="100" w:left="360" w:hangingChars="50" w:hanging="120"/>
-        <w:rPr>
-          <w:b/>
-          <w:bCs/>
-        </w:rPr>
-      </w:pPr>
-      <w:r>
-        <w:rPr>
-          <w:b/>
-          <w:bCs/>
-        </w:rPr>
-        <w:t>7-Compatibility: Works on mobile phones (iOS &amp; Android), tablets, and desktop computers.</w:t>
-      </w:r>
-    </w:p>
-    <w:p>
-      <w:pPr>
-        <w:ind w:leftChars="100" w:left="360" w:hangingChars="50" w:hanging="120"/>
-        <w:rPr>
-          <w:b/>
-          <w:bCs/>
-        </w:rPr>
-      </w:pPr>
-      <w:r>
-        <w:rPr>
-          <w:b/>
-          <w:bCs/>
-        </w:rPr>
-        <w:t>8-Localization: Supports multiple languages, including Arabic and English, with proper layout for right-to-left text.</w:t>
-      </w:r>
-    </w:p>
-    <w:p>
-      <w:pPr>
-        <w:ind w:leftChars="100" w:left="360" w:hangingChars="50" w:hanging="120"/>
-        <w:rPr>
-          <w:b/>
-          <w:bCs/>
-          <w:lang w:bidi="ar-EG"/>
-        </w:rPr>
-      </w:pPr>
-      <w:r>
-        <w:rPr>
-          <w:b/>
-          <w:bCs/>
-        </w:rPr>
-        <w:t>9-Backup &amp; Recovery: Regular data backup and recovery plan to prevent data loss.</w:t>
-      </w:r>
-    </w:p>
-    <w:p>
-      <w:pPr>
-        <w:rPr>
-          <w:b/>
-          <w:bCs/>
-          <w:sz w:val="32"/>
-          <w:szCs w:val="32"/>
-          <w:lang w:bidi="ar-EG"/>
-        </w:rPr>
-      </w:pPr>
-    </w:p>
-    <w:p>
-      <w:pPr>
-        <w:rPr>
-          <w:b/>
-          <w:bCs/>
-          <w:sz w:val="32"/>
-          <w:szCs w:val="32"/>
-          <w:lang w:bidi="ar-EG"/>
-        </w:rPr>
-      </w:pPr>
-    </w:p>
-    <w:p>
-      <w:pPr>
-        <w:rPr>
-          <w:b/>
-          <w:bCs/>
-          <w:sz w:val="32"/>
-          <w:szCs w:val="32"/>
-          <w:lang w:bidi="ar-EG"/>
-        </w:rPr>
-      </w:pPr>
-    </w:p>
-    <w:p>
-      <w:pPr>
-        <w:rPr>
-          <w:b/>
-          <w:bCs/>
-          <w:sz w:val="32"/>
-          <w:szCs w:val="32"/>
-          <w:lang w:bidi="ar-EG"/>
-        </w:rPr>
-      </w:pPr>
-    </w:p>
-    <w:p>
-      <w:pPr>
-        <w:rPr>
-          <w:b/>
-          <w:bCs/>
-          <w:sz w:val="28"/>
-          <w:szCs w:val="28"/>
-          <w:lang w:bidi="ar-EG"/>
-        </w:rPr>
-      </w:pPr>
-      <w:r>
-        <w:rPr>
-          <w:b/>
-          <w:bCs/>
-          <w:sz w:val="28"/>
-          <w:szCs w:val="28"/>
-          <w:lang w:bidi="ar-EG"/>
-        </w:rPr>
         <w:t xml:space="preserve">  2.1.</w:t>
       </w:r>
       <w:r>
@@ -4088,7 +4066,6 @@
           <w:szCs w:val="22"/>
           <w:lang w:bidi="ar-EG"/>
         </w:rPr>
-        <w:lastRenderedPageBreak/>
         <w:t xml:space="preserve">       the complete system is delivered. Early increments may contain core functionality, and subsequent  </w:t>
       </w:r>
     </w:p>
@@ -4600,6 +4577,7 @@
           <w:szCs w:val="32"/>
           <w:lang w:bidi="ar-EG"/>
         </w:rPr>
+        <w:lastRenderedPageBreak/>
         <w:t>2.2 System Models</w:t>
       </w:r>
     </w:p>
@@ -4642,7 +4620,6 @@
           <w:lang w:bidi="ar-EG"/>
           <w14:ligatures w14:val="none"/>
         </w:rPr>
-        <w:lastRenderedPageBreak/>
         <w:drawing>
           <wp:anchor distT="0" distB="0" distL="114300" distR="114300" simplePos="0" relativeHeight="251661312" behindDoc="0" locked="0" layoutInCell="1" allowOverlap="1" wp14:anchorId="370A6DD6" wp14:editId="6E4C3129">
             <wp:simplePos x="0" y="0"/>
@@ -4726,15 +4703,6 @@
           <w:lang w:bidi="ar-EG"/>
         </w:rPr>
       </w:pPr>
-    </w:p>
-    <w:p>
-      <w:pPr>
-        <w:rPr>
-          <w:b/>
-          <w:bCs/>
-          <w:lang w:bidi="ar-EG"/>
-        </w:rPr>
-      </w:pPr>
       <w:r>
         <w:rPr>
           <w:b/>
@@ -4766,92 +4734,23 @@
         <w:rPr>
           <w:b/>
           <w:bCs/>
-          <w:lang w:bidi="ar-EG"/>
-        </w:rPr>
-        <w:t xml:space="preserve">Blind </w:t>
-      </w:r>
-      <w:proofErr w:type="spellStart"/>
-      <w:r>
-        <w:rPr>
-          <w:b/>
-          <w:bCs/>
-          <w:lang w:bidi="ar-EG"/>
-        </w:rPr>
-        <w:t>SequenceD</w:t>
-      </w:r>
-      <w:proofErr w:type="spellEnd"/>
-      <w:r>
-        <w:rPr>
-          <w:b/>
-          <w:bCs/>
-          <w:lang w:bidi="ar-EG"/>
-        </w:rPr>
-        <w:t xml:space="preserve"> </w:t>
-      </w:r>
-    </w:p>
-    <w:p>
-      <w:pPr>
-        <w:rPr>
-          <w:b/>
-          <w:bCs/>
-          <w:lang w:bidi="ar-EG"/>
-        </w:rPr>
-      </w:pPr>
-      <w:r>
-        <w:rPr>
-          <w:b/>
-          <w:bCs/>
           <w:noProof/>
           <w:lang w:bidi="ar-EG"/>
           <w14:ligatures w14:val="none"/>
         </w:rPr>
         <w:drawing>
-          <wp:anchor distT="0" distB="0" distL="114300" distR="114300" simplePos="0" relativeHeight="251662336" behindDoc="1" locked="0" layoutInCell="1" allowOverlap="1" wp14:anchorId="73A49922" wp14:editId="73AA429F">
+          <wp:anchor distT="0" distB="0" distL="114300" distR="114300" simplePos="0" relativeHeight="251664384" behindDoc="1" locked="0" layoutInCell="1" allowOverlap="1" wp14:anchorId="4B3C9C87" wp14:editId="5F89A37F">
             <wp:simplePos x="0" y="0"/>
             <wp:positionH relativeFrom="margin">
-              <wp:posOffset>160020</wp:posOffset>
+              <wp:posOffset>138545</wp:posOffset>
             </wp:positionH>
             <wp:positionV relativeFrom="paragraph">
-              <wp:posOffset>-214630</wp:posOffset>
+              <wp:posOffset>214168</wp:posOffset>
             </wp:positionV>
-            <wp:extent cx="6278880" cy="3208020"/>
-            <wp:effectExtent l="0" t="0" r="0" b="0"/>
-            <wp:wrapTight wrapText="bothSides">
-              <wp:wrapPolygon edited="0">
-                <wp:start x="3604" y="128"/>
-                <wp:lineTo x="3539" y="2052"/>
-                <wp:lineTo x="10813" y="2437"/>
-                <wp:lineTo x="1114" y="2950"/>
-                <wp:lineTo x="917" y="4874"/>
-                <wp:lineTo x="983" y="5515"/>
-                <wp:lineTo x="1245" y="6542"/>
-                <wp:lineTo x="1245" y="8594"/>
-                <wp:lineTo x="983" y="9620"/>
-                <wp:lineTo x="917" y="12698"/>
-                <wp:lineTo x="655" y="13853"/>
-                <wp:lineTo x="590" y="18342"/>
-                <wp:lineTo x="786" y="18855"/>
-                <wp:lineTo x="1245" y="18855"/>
-                <wp:lineTo x="1245" y="20523"/>
-                <wp:lineTo x="20381" y="21292"/>
-                <wp:lineTo x="20840" y="21292"/>
-                <wp:lineTo x="20905" y="14751"/>
-                <wp:lineTo x="21233" y="12955"/>
-                <wp:lineTo x="21167" y="9620"/>
-                <wp:lineTo x="20905" y="8466"/>
-                <wp:lineTo x="9568" y="6542"/>
-                <wp:lineTo x="10879" y="6542"/>
-                <wp:lineTo x="17760" y="4874"/>
-                <wp:lineTo x="21495" y="4489"/>
-                <wp:lineTo x="21299" y="3078"/>
-                <wp:lineTo x="10813" y="2437"/>
-                <wp:lineTo x="13697" y="2437"/>
-                <wp:lineTo x="14745" y="1924"/>
-                <wp:lineTo x="14680" y="128"/>
-                <wp:lineTo x="3604" y="128"/>
-              </wp:wrapPolygon>
-            </wp:wrapTight>
-            <wp:docPr id="1" name="Picture 1"/>
+            <wp:extent cx="5364480" cy="2740660"/>
+            <wp:effectExtent l="0" t="0" r="0" b="2540"/>
+            <wp:wrapTopAndBottom/>
+            <wp:docPr id="846520552" name="Picture 846520552" descr="A screenshot of a computer&#10;&#10;AI-generated content may be incorrect."/>
             <wp:cNvGraphicFramePr>
               <a:graphicFrameLocks xmlns:a="http://schemas.openxmlformats.org/drawingml/2006/main" noChangeAspect="1"/>
             </wp:cNvGraphicFramePr>
@@ -4859,7 +4758,7 @@
               <a:graphicData uri="http://schemas.openxmlformats.org/drawingml/2006/picture">
                 <pic:pic xmlns:pic="http://schemas.openxmlformats.org/drawingml/2006/picture">
                   <pic:nvPicPr>
-                    <pic:cNvPr id="1" name="Picture 1"/>
+                    <pic:cNvPr id="846520552" name="Picture 846520552" descr="A screenshot of a computer&#10;&#10;AI-generated content may be incorrect."/>
                     <pic:cNvPicPr/>
                   </pic:nvPicPr>
                   <pic:blipFill>
@@ -4877,7 +4776,7 @@
                   <pic:spPr>
                     <a:xfrm>
                       <a:off x="0" y="0"/>
-                      <a:ext cx="6278880" cy="3208020"/>
+                      <a:ext cx="5364480" cy="2740660"/>
                     </a:xfrm>
                     <a:prstGeom prst="rect">
                       <a:avLst/>
@@ -4895,71 +4794,57 @@
           </wp:anchor>
         </w:drawing>
       </w:r>
-    </w:p>
-    <w:p>
-      <w:pPr>
-        <w:rPr>
-          <w:b/>
-          <w:bCs/>
-          <w:sz w:val="32"/>
-          <w:szCs w:val="32"/>
-          <w:lang w:bidi="ar-EG"/>
-        </w:rPr>
-      </w:pPr>
-    </w:p>
-    <w:p>
-      <w:pPr>
-        <w:rPr>
-          <w:b/>
-          <w:bCs/>
-          <w:sz w:val="32"/>
-          <w:szCs w:val="32"/>
-          <w:lang w:bidi="ar-EG"/>
-        </w:rPr>
-      </w:pPr>
-    </w:p>
-    <w:p>
-      <w:pPr>
-        <w:rPr>
-          <w:b/>
-          <w:bCs/>
-          <w:sz w:val="32"/>
-          <w:szCs w:val="32"/>
-          <w:lang w:bidi="ar-EG"/>
-        </w:rPr>
-      </w:pPr>
-    </w:p>
-    <w:p>
-      <w:pPr>
-        <w:rPr>
-          <w:b/>
-          <w:bCs/>
-          <w:sz w:val="32"/>
-          <w:szCs w:val="32"/>
-          <w:lang w:bidi="ar-EG"/>
-        </w:rPr>
-      </w:pPr>
-    </w:p>
-    <w:p>
-      <w:pPr>
-        <w:rPr>
-          <w:b/>
-          <w:bCs/>
-          <w:sz w:val="32"/>
-          <w:szCs w:val="32"/>
-          <w:lang w:bidi="ar-EG"/>
-        </w:rPr>
-      </w:pPr>
-    </w:p>
-    <w:p>
-      <w:pPr>
-        <w:rPr>
-          <w:b/>
-          <w:bCs/>
-          <w:lang w:bidi="ar-EG"/>
-        </w:rPr>
-      </w:pPr>
-      <w:proofErr w:type="spellStart"/>
+      <w:r>
+        <w:rPr>
+          <w:rFonts w:hint="cs"/>
+          <w:b/>
+          <w:bCs/>
+          <w:rtl/>
+          <w:lang w:bidi="ar-EG"/>
+        </w:rPr>
+        <w:t xml:space="preserve">          </w:t>
+      </w:r>
+      <w:r>
+        <w:rPr>
+          <w:b/>
+          <w:bCs/>
+          <w:lang w:bidi="ar-EG"/>
+        </w:rPr>
+        <w:t>2</w:t>
+      </w:r>
+      <w:r>
+        <w:rPr>
+          <w:b/>
+          <w:bCs/>
+          <w:lang w:bidi="ar-EG"/>
+        </w:rPr>
+        <w:t>.2.1.2.1</w:t>
+      </w:r>
+      <w:r>
+        <w:rPr>
+          <w:b/>
+          <w:bCs/>
+          <w:lang w:bidi="ar-EG"/>
+        </w:rPr>
+        <w:t xml:space="preserve">Blind </w:t>
+      </w:r>
+      <w:r>
+        <w:rPr>
+          <w:b/>
+          <w:bCs/>
+          <w:lang w:bidi="ar-EG"/>
+        </w:rPr>
+        <w:t>Sequence Diagram</w:t>
+      </w:r>
+    </w:p>
+    <w:p>
+      <w:pPr>
+        <w:rPr>
+          <w:b/>
+          <w:bCs/>
+          <w:lang w:bidi="ar-EG"/>
+        </w:rPr>
+      </w:pPr>
       <w:r>
         <w:rPr>
           <w:b/>
@@ -4967,9 +4852,16 @@
           <w:lang w:bidi="ar-EG"/>
         </w:rPr>
         <w:lastRenderedPageBreak/>
+        <w:t xml:space="preserve">       2.2.1.2.2</w:t>
+      </w:r>
+      <w:r>
+        <w:rPr>
+          <w:b/>
+          <w:bCs/>
+          <w:lang w:bidi="ar-EG"/>
+        </w:rPr>
         <w:t>DeafMuteUser</w:t>
       </w:r>
-      <w:proofErr w:type="spellEnd"/>
       <w:r>
         <w:rPr>
           <w:b/>
@@ -4978,16 +4870,14 @@
         </w:rPr>
         <w:t xml:space="preserve"> </w:t>
       </w:r>
-      <w:proofErr w:type="spellStart"/>
-      <w:r>
-        <w:rPr>
-          <w:b/>
-          <w:bCs/>
-          <w:lang w:bidi="ar-EG"/>
-        </w:rPr>
-        <w:t>SequenceD</w:t>
-      </w:r>
-      <w:proofErr w:type="spellEnd"/>
+      <w:r>
+        <w:rPr>
+          <w:b/>
+          <w:bCs/>
+          <w:lang w:bidi="ar-EG"/>
+        </w:rPr>
+        <w:t>Sequence Diagram</w:t>
+      </w:r>
       <w:r>
         <w:rPr>
           <w:b/>
@@ -5114,6 +5004,77 @@
           <w:szCs w:val="28"/>
           <w:lang w:bidi="ar-EG"/>
         </w:rPr>
+        <w:drawing>
+          <wp:anchor distT="0" distB="0" distL="114300" distR="114300" simplePos="0" relativeHeight="251665408" behindDoc="0" locked="0" layoutInCell="1" allowOverlap="1" wp14:anchorId="2327E4B9" wp14:editId="77D30AFC">
+            <wp:simplePos x="0" y="0"/>
+            <wp:positionH relativeFrom="margin">
+              <wp:posOffset>-90459</wp:posOffset>
+            </wp:positionH>
+            <wp:positionV relativeFrom="paragraph">
+              <wp:posOffset>369512</wp:posOffset>
+            </wp:positionV>
+            <wp:extent cx="4197350" cy="1156970"/>
+            <wp:effectExtent l="0" t="0" r="0" b="5080"/>
+            <wp:wrapTopAndBottom/>
+            <wp:docPr id="998448760" name="Picture 2" descr="A diagram of a computer&#10;&#10;AI-generated content may be incorrect."/>
+            <wp:cNvGraphicFramePr>
+              <a:graphicFrameLocks xmlns:a="http://schemas.openxmlformats.org/drawingml/2006/main" noChangeAspect="1"/>
+            </wp:cNvGraphicFramePr>
+            <a:graphic xmlns:a="http://schemas.openxmlformats.org/drawingml/2006/main">
+              <a:graphicData uri="http://schemas.openxmlformats.org/drawingml/2006/picture">
+                <pic:pic xmlns:pic="http://schemas.openxmlformats.org/drawingml/2006/picture">
+                  <pic:nvPicPr>
+                    <pic:cNvPr id="998448760" name="Picture 2" descr="A diagram of a computer&#10;&#10;AI-generated content may be incorrect."/>
+                    <pic:cNvPicPr>
+                      <a:picLocks noChangeAspect="1" noChangeArrowheads="1"/>
+                    </pic:cNvPicPr>
+                  </pic:nvPicPr>
+                  <pic:blipFill>
+                    <a:blip r:embed="rId16" cstate="print">
+                      <a:extLst>
+                        <a:ext uri="{28A0092B-C50C-407E-A947-70E740481C1C}">
+                          <a14:useLocalDpi xmlns:a14="http://schemas.microsoft.com/office/drawing/2010/main" val="0"/>
+                        </a:ext>
+                      </a:extLst>
+                    </a:blip>
+                    <a:srcRect/>
+                    <a:stretch>
+                      <a:fillRect/>
+                    </a:stretch>
+                  </pic:blipFill>
+                  <pic:spPr bwMode="auto">
+                    <a:xfrm>
+                      <a:off x="0" y="0"/>
+                      <a:ext cx="4197350" cy="1156970"/>
+                    </a:xfrm>
+                    <a:prstGeom prst="rect">
+                      <a:avLst/>
+                    </a:prstGeom>
+                    <a:noFill/>
+                    <a:ln>
+                      <a:noFill/>
+                    </a:ln>
+                  </pic:spPr>
+                </pic:pic>
+              </a:graphicData>
+            </a:graphic>
+            <wp14:sizeRelH relativeFrom="margin">
+              <wp14:pctWidth>0</wp14:pctWidth>
+            </wp14:sizeRelH>
+            <wp14:sizeRelV relativeFrom="margin">
+              <wp14:pctHeight>0</wp14:pctHeight>
+            </wp14:sizeRelV>
+          </wp:anchor>
+        </w:drawing>
+      </w:r>
+      <w:r>
+        <w:rPr>
+          <w:b/>
+          <w:bCs/>
+          <w:sz w:val="28"/>
+          <w:szCs w:val="28"/>
+          <w:lang w:bidi="ar-EG"/>
+        </w:rPr>
         <w:t xml:space="preserve">       </w:t>
       </w:r>
       <w:r>
@@ -5122,72 +5083,112 @@
           <w:bCs/>
           <w:lang w:bidi="ar-EG"/>
         </w:rPr>
-        <w:t>2.2.2.1 Context Diagram</w:t>
-      </w:r>
-    </w:p>
-    <w:p>
-      <w:pPr>
-        <w:rPr>
-          <w:b/>
-          <w:bCs/>
-          <w:sz w:val="28"/>
-          <w:szCs w:val="28"/>
-          <w:lang w:bidi="ar-EG"/>
-        </w:rPr>
-      </w:pPr>
-      <w:r>
-        <w:rPr>
-          <w:b/>
-          <w:bCs/>
-          <w:sz w:val="28"/>
-          <w:szCs w:val="28"/>
-          <w:lang w:bidi="ar-EG"/>
-        </w:rPr>
+        <w:t>2.2.2.1 Context Diagra</w:t>
+      </w:r>
+      <w:r>
+        <w:rPr>
+          <w:b/>
+          <w:bCs/>
+          <w:lang w:bidi="ar-EG"/>
+        </w:rPr>
+        <w:t>m</w:t>
+      </w:r>
+    </w:p>
+    <w:p>
+      <w:pPr>
+        <w:rPr>
+          <w:b/>
+          <w:bCs/>
+          <w:lang w:bidi="ar-EG"/>
+        </w:rPr>
+      </w:pPr>
+      <w:r>
+        <w:rPr>
+          <w:b/>
+          <w:bCs/>
+          <w:sz w:val="28"/>
+          <w:szCs w:val="28"/>
+          <w:lang w:bidi="ar-EG"/>
+        </w:rPr>
+        <w:lastRenderedPageBreak/>
         <w:t xml:space="preserve">       </w:t>
       </w:r>
-    </w:p>
-    <w:p>
-      <w:pPr>
-        <w:rPr>
-          <w:b/>
-          <w:bCs/>
-          <w:sz w:val="28"/>
-          <w:szCs w:val="28"/>
-          <w:lang w:bidi="ar-EG"/>
-        </w:rPr>
-      </w:pPr>
-      <w:r>
-        <w:rPr>
-          <w:b/>
-          <w:bCs/>
-          <w:sz w:val="28"/>
-          <w:szCs w:val="28"/>
-          <w:lang w:bidi="ar-EG"/>
-        </w:rPr>
-        <w:t xml:space="preserve">   </w:t>
-      </w:r>
-    </w:p>
-    <w:p>
-      <w:pPr>
-        <w:rPr>
-          <w:b/>
-          <w:bCs/>
-          <w:sz w:val="28"/>
-          <w:szCs w:val="28"/>
-          <w:lang w:bidi="ar-EG"/>
-        </w:rPr>
-      </w:pPr>
-    </w:p>
-    <w:p>
-      <w:pPr>
-        <w:rPr>
-          <w:b/>
-          <w:bCs/>
-          <w:sz w:val="28"/>
-          <w:szCs w:val="28"/>
-          <w:lang w:bidi="ar-EG"/>
-        </w:rPr>
-      </w:pPr>
+      <w:r>
+        <w:rPr>
+          <w:b/>
+          <w:bCs/>
+          <w:lang w:bidi="ar-EG"/>
+        </w:rPr>
+        <w:t>2.2.2.2 DFD (Level 1)</w:t>
+      </w:r>
+    </w:p>
+    <w:p>
+      <w:pPr>
+        <w:rPr>
+          <w:b/>
+          <w:bCs/>
+          <w:sz w:val="28"/>
+          <w:szCs w:val="28"/>
+          <w:lang w:bidi="ar-EG"/>
+        </w:rPr>
+      </w:pPr>
+      <w:r>
+        <w:rPr>
+          <w:b/>
+          <w:bCs/>
+          <w:sz w:val="28"/>
+          <w:szCs w:val="28"/>
+          <w:lang w:bidi="ar-EG"/>
+        </w:rPr>
+        <w:drawing>
+          <wp:inline distT="0" distB="0" distL="0" distR="0" wp14:anchorId="4A2CB9D6" wp14:editId="110BCEC6">
+            <wp:extent cx="6038734" cy="3235036"/>
+            <wp:effectExtent l="0" t="0" r="0" b="0"/>
+            <wp:docPr id="1296290676" name="Picture 6" descr="A screenshot of a computer screen&#10;&#10;AI-generated content may be incorrect."/>
+            <wp:cNvGraphicFramePr>
+              <a:graphicFrameLocks xmlns:a="http://schemas.openxmlformats.org/drawingml/2006/main" noChangeAspect="1"/>
+            </wp:cNvGraphicFramePr>
+            <a:graphic xmlns:a="http://schemas.openxmlformats.org/drawingml/2006/main">
+              <a:graphicData uri="http://schemas.openxmlformats.org/drawingml/2006/picture">
+                <pic:pic xmlns:pic="http://schemas.openxmlformats.org/drawingml/2006/picture">
+                  <pic:nvPicPr>
+                    <pic:cNvPr id="1296290676" name="Picture 6" descr="A screenshot of a computer screen&#10;&#10;AI-generated content may be incorrect."/>
+                    <pic:cNvPicPr>
+                      <a:picLocks noChangeAspect="1" noChangeArrowheads="1"/>
+                    </pic:cNvPicPr>
+                  </pic:nvPicPr>
+                  <pic:blipFill>
+                    <a:blip r:embed="rId17" cstate="print">
+                      <a:extLst>
+                        <a:ext uri="{28A0092B-C50C-407E-A947-70E740481C1C}">
+                          <a14:useLocalDpi xmlns:a14="http://schemas.microsoft.com/office/drawing/2010/main" val="0"/>
+                        </a:ext>
+                      </a:extLst>
+                    </a:blip>
+                    <a:srcRect/>
+                    <a:stretch>
+                      <a:fillRect/>
+                    </a:stretch>
+                  </pic:blipFill>
+                  <pic:spPr bwMode="auto">
+                    <a:xfrm>
+                      <a:off x="0" y="0"/>
+                      <a:ext cx="6051880" cy="3242079"/>
+                    </a:xfrm>
+                    <a:prstGeom prst="rect">
+                      <a:avLst/>
+                    </a:prstGeom>
+                    <a:noFill/>
+                    <a:ln>
+                      <a:noFill/>
+                    </a:ln>
+                  </pic:spPr>
+                </pic:pic>
+              </a:graphicData>
+            </a:graphic>
+          </wp:inline>
+        </w:drawing>
+      </w:r>
     </w:p>
     <w:p>
       <w:pPr>
@@ -5213,121 +5214,6 @@
           <w:bCs/>
           <w:lang w:bidi="ar-EG"/>
         </w:rPr>
-        <w:t>2.2.2.2 DFD (Level 1)</w:t>
-      </w:r>
-    </w:p>
-    <w:p>
-      <w:pPr>
-        <w:rPr>
-          <w:b/>
-          <w:bCs/>
-          <w:sz w:val="28"/>
-          <w:szCs w:val="28"/>
-          <w:lang w:bidi="ar-EG"/>
-        </w:rPr>
-      </w:pPr>
-    </w:p>
-    <w:p>
-      <w:pPr>
-        <w:rPr>
-          <w:b/>
-          <w:bCs/>
-          <w:sz w:val="28"/>
-          <w:szCs w:val="28"/>
-          <w:lang w:bidi="ar-EG"/>
-        </w:rPr>
-      </w:pPr>
-    </w:p>
-    <w:p>
-      <w:pPr>
-        <w:rPr>
-          <w:b/>
-          <w:bCs/>
-          <w:sz w:val="28"/>
-          <w:szCs w:val="28"/>
-          <w:lang w:bidi="ar-EG"/>
-        </w:rPr>
-      </w:pPr>
-    </w:p>
-    <w:p>
-      <w:pPr>
-        <w:rPr>
-          <w:b/>
-          <w:bCs/>
-          <w:sz w:val="28"/>
-          <w:szCs w:val="28"/>
-          <w:lang w:bidi="ar-EG"/>
-        </w:rPr>
-      </w:pPr>
-    </w:p>
-    <w:p>
-      <w:pPr>
-        <w:rPr>
-          <w:b/>
-          <w:bCs/>
-          <w:sz w:val="28"/>
-          <w:szCs w:val="28"/>
-          <w:lang w:bidi="ar-EG"/>
-        </w:rPr>
-      </w:pPr>
-    </w:p>
-    <w:p>
-      <w:pPr>
-        <w:rPr>
-          <w:b/>
-          <w:bCs/>
-          <w:sz w:val="28"/>
-          <w:szCs w:val="28"/>
-          <w:lang w:bidi="ar-EG"/>
-        </w:rPr>
-      </w:pPr>
-    </w:p>
-    <w:p>
-      <w:pPr>
-        <w:rPr>
-          <w:b/>
-          <w:bCs/>
-          <w:sz w:val="28"/>
-          <w:szCs w:val="28"/>
-          <w:lang w:bidi="ar-EG"/>
-        </w:rPr>
-      </w:pPr>
-    </w:p>
-    <w:p>
-      <w:pPr>
-        <w:rPr>
-          <w:b/>
-          <w:bCs/>
-          <w:sz w:val="28"/>
-          <w:szCs w:val="28"/>
-          <w:lang w:bidi="ar-EG"/>
-        </w:rPr>
-      </w:pPr>
-    </w:p>
-    <w:p>
-      <w:pPr>
-        <w:rPr>
-          <w:b/>
-          <w:bCs/>
-          <w:lang w:bidi="ar-EG"/>
-        </w:rPr>
-      </w:pPr>
-      <w:r>
-        <w:rPr>
-          <w:b/>
-          <w:bCs/>
-          <w:sz w:val="28"/>
-          <w:szCs w:val="28"/>
-          <w:lang w:bidi="ar-EG"/>
-        </w:rPr>
-        <w:t xml:space="preserve">       </w:t>
-      </w:r>
-      <w:r>
-        <w:rPr>
-          <w:b/>
-          <w:bCs/>
-          <w:lang w:bidi="ar-EG"/>
-        </w:rPr>
         <w:t>2.2.2.3 DFD (Level 2)</w:t>
       </w:r>
     </w:p>
@@ -5349,50 +5235,147 @@
           <w:bCs/>
           <w:sz w:val="28"/>
           <w:szCs w:val="28"/>
-          <w:lang w:bidi="ar-EG"/>
-        </w:rPr>
-      </w:pPr>
-    </w:p>
-    <w:p>
-      <w:pPr>
-        <w:rPr>
-          <w:b/>
-          <w:bCs/>
-          <w:sz w:val="28"/>
-          <w:szCs w:val="28"/>
-          <w:lang w:bidi="ar-EG"/>
-        </w:rPr>
-      </w:pPr>
-    </w:p>
-    <w:p>
-      <w:pPr>
-        <w:rPr>
-          <w:b/>
-          <w:bCs/>
-          <w:sz w:val="28"/>
-          <w:szCs w:val="28"/>
-          <w:lang w:bidi="ar-EG"/>
-        </w:rPr>
-      </w:pPr>
-    </w:p>
-    <w:p>
-      <w:pPr>
-        <w:rPr>
-          <w:b/>
-          <w:bCs/>
-          <w:sz w:val="28"/>
-          <w:szCs w:val="28"/>
-          <w:lang w:bidi="ar-EG"/>
-        </w:rPr>
-      </w:pPr>
-      <w:r>
-        <w:rPr>
-          <w:b/>
-          <w:bCs/>
-          <w:sz w:val="28"/>
-          <w:szCs w:val="28"/>
-          <w:lang w:bidi="ar-EG"/>
-        </w:rPr>
+          <w:rtl/>
+          <w:lang w:bidi="ar-EG"/>
+        </w:rPr>
+      </w:pPr>
+    </w:p>
+    <w:p>
+      <w:pPr>
+        <w:rPr>
+          <w:b/>
+          <w:bCs/>
+          <w:sz w:val="28"/>
+          <w:szCs w:val="28"/>
+          <w:rtl/>
+          <w:lang w:bidi="ar-EG"/>
+        </w:rPr>
+      </w:pPr>
+    </w:p>
+    <w:p>
+      <w:pPr>
+        <w:rPr>
+          <w:b/>
+          <w:bCs/>
+          <w:sz w:val="28"/>
+          <w:szCs w:val="28"/>
+          <w:rtl/>
+          <w:lang w:bidi="ar-EG"/>
+        </w:rPr>
+      </w:pPr>
+    </w:p>
+    <w:p>
+      <w:pPr>
+        <w:rPr>
+          <w:b/>
+          <w:bCs/>
+          <w:sz w:val="28"/>
+          <w:szCs w:val="28"/>
+          <w:rtl/>
+          <w:lang w:bidi="ar-EG"/>
+        </w:rPr>
+      </w:pPr>
+    </w:p>
+    <w:p>
+      <w:pPr>
+        <w:rPr>
+          <w:b/>
+          <w:bCs/>
+          <w:sz w:val="28"/>
+          <w:szCs w:val="28"/>
+          <w:rtl/>
+          <w:lang w:bidi="ar-EG"/>
+        </w:rPr>
+      </w:pPr>
+    </w:p>
+    <w:p>
+      <w:pPr>
+        <w:rPr>
+          <w:b/>
+          <w:bCs/>
+          <w:sz w:val="28"/>
+          <w:szCs w:val="28"/>
+          <w:lang w:bidi="ar-EG"/>
+        </w:rPr>
+      </w:pPr>
+    </w:p>
+    <w:p>
+      <w:pPr>
+        <w:rPr>
+          <w:b/>
+          <w:bCs/>
+          <w:sz w:val="28"/>
+          <w:szCs w:val="28"/>
+          <w:lang w:bidi="ar-EG"/>
+        </w:rPr>
+      </w:pPr>
+    </w:p>
+    <w:p>
+      <w:pPr>
+        <w:rPr>
+          <w:b/>
+          <w:bCs/>
+          <w:sz w:val="28"/>
+          <w:szCs w:val="28"/>
+          <w:rtl/>
+          <w:lang w:bidi="ar-EG"/>
+        </w:rPr>
+      </w:pPr>
+    </w:p>
+    <w:p>
+      <w:pPr>
+        <w:rPr>
+          <w:b/>
+          <w:bCs/>
+          <w:sz w:val="28"/>
+          <w:szCs w:val="28"/>
+          <w:rtl/>
+          <w:lang w:bidi="ar-EG"/>
+        </w:rPr>
+      </w:pPr>
+    </w:p>
+    <w:p>
+      <w:pPr>
+        <w:rPr>
+          <w:b/>
+          <w:bCs/>
+          <w:sz w:val="28"/>
+          <w:szCs w:val="28"/>
+          <w:rtl/>
+          <w:lang w:bidi="ar-EG"/>
+        </w:rPr>
+      </w:pPr>
+    </w:p>
+    <w:p>
+      <w:pPr>
+        <w:rPr>
+          <w:b/>
+          <w:bCs/>
+          <w:sz w:val="28"/>
+          <w:szCs w:val="28"/>
+          <w:lang w:bidi="ar-EG"/>
+        </w:rPr>
+      </w:pPr>
+    </w:p>
+    <w:p>
+      <w:pPr>
+        <w:rPr>
+          <w:b/>
+          <w:bCs/>
+          <w:sz w:val="28"/>
+          <w:szCs w:val="28"/>
+          <w:lang w:bidi="ar-EG"/>
+        </w:rPr>
+      </w:pPr>
+      <w:r>
+        <w:rPr>
+          <w:b/>
+          <w:bCs/>
+          <w:sz w:val="28"/>
+          <w:szCs w:val="28"/>
+          <w:lang w:bidi="ar-EG"/>
+        </w:rPr>
+        <w:lastRenderedPageBreak/>
         <w:t xml:space="preserve">   2.2.3 Activity Diagram</w:t>
       </w:r>
     </w:p>
@@ -5403,28 +5386,293 @@
           <w:bCs/>
           <w:sz w:val="28"/>
           <w:szCs w:val="28"/>
-          <w:lang w:bidi="ar-EG"/>
-        </w:rPr>
-      </w:pPr>
-    </w:p>
-    <w:p>
-      <w:pPr>
-        <w:rPr>
-          <w:b/>
-          <w:bCs/>
-          <w:sz w:val="28"/>
-          <w:szCs w:val="28"/>
-          <w:lang w:bidi="ar-EG"/>
-        </w:rPr>
-      </w:pPr>
-      <w:r>
-        <w:rPr>
-          <w:b/>
-          <w:bCs/>
-          <w:sz w:val="32"/>
-          <w:szCs w:val="32"/>
-          <w:lang w:bidi="ar-EG"/>
-        </w:rPr>
+          <w:rtl/>
+          <w:lang w:bidi="ar-EG"/>
+        </w:rPr>
+      </w:pPr>
+    </w:p>
+    <w:p>
+      <w:pPr>
+        <w:rPr>
+          <w:b/>
+          <w:bCs/>
+          <w:sz w:val="28"/>
+          <w:szCs w:val="28"/>
+          <w:rtl/>
+          <w:lang w:bidi="ar-EG"/>
+        </w:rPr>
+      </w:pPr>
+    </w:p>
+    <w:p>
+      <w:pPr>
+        <w:rPr>
+          <w:b/>
+          <w:bCs/>
+          <w:sz w:val="28"/>
+          <w:szCs w:val="28"/>
+          <w:rtl/>
+          <w:lang w:bidi="ar-EG"/>
+        </w:rPr>
+      </w:pPr>
+    </w:p>
+    <w:p>
+      <w:pPr>
+        <w:rPr>
+          <w:b/>
+          <w:bCs/>
+          <w:sz w:val="28"/>
+          <w:szCs w:val="28"/>
+          <w:rtl/>
+          <w:lang w:bidi="ar-EG"/>
+        </w:rPr>
+      </w:pPr>
+    </w:p>
+    <w:p>
+      <w:pPr>
+        <w:rPr>
+          <w:b/>
+          <w:bCs/>
+          <w:sz w:val="28"/>
+          <w:szCs w:val="28"/>
+          <w:rtl/>
+          <w:lang w:bidi="ar-EG"/>
+        </w:rPr>
+      </w:pPr>
+    </w:p>
+    <w:p>
+      <w:pPr>
+        <w:rPr>
+          <w:b/>
+          <w:bCs/>
+          <w:sz w:val="28"/>
+          <w:szCs w:val="28"/>
+          <w:rtl/>
+          <w:lang w:bidi="ar-EG"/>
+        </w:rPr>
+      </w:pPr>
+    </w:p>
+    <w:p>
+      <w:pPr>
+        <w:rPr>
+          <w:b/>
+          <w:bCs/>
+          <w:sz w:val="28"/>
+          <w:szCs w:val="28"/>
+          <w:rtl/>
+          <w:lang w:bidi="ar-EG"/>
+        </w:rPr>
+      </w:pPr>
+    </w:p>
+    <w:p>
+      <w:pPr>
+        <w:rPr>
+          <w:b/>
+          <w:bCs/>
+          <w:sz w:val="28"/>
+          <w:szCs w:val="28"/>
+          <w:rtl/>
+          <w:lang w:bidi="ar-EG"/>
+        </w:rPr>
+      </w:pPr>
+    </w:p>
+    <w:p>
+      <w:pPr>
+        <w:rPr>
+          <w:b/>
+          <w:bCs/>
+          <w:sz w:val="28"/>
+          <w:szCs w:val="28"/>
+          <w:rtl/>
+          <w:lang w:bidi="ar-EG"/>
+        </w:rPr>
+      </w:pPr>
+    </w:p>
+    <w:p>
+      <w:pPr>
+        <w:rPr>
+          <w:b/>
+          <w:bCs/>
+          <w:sz w:val="28"/>
+          <w:szCs w:val="28"/>
+          <w:rtl/>
+          <w:lang w:bidi="ar-EG"/>
+        </w:rPr>
+      </w:pPr>
+    </w:p>
+    <w:p>
+      <w:pPr>
+        <w:rPr>
+          <w:b/>
+          <w:bCs/>
+          <w:sz w:val="28"/>
+          <w:szCs w:val="28"/>
+          <w:rtl/>
+          <w:lang w:bidi="ar-EG"/>
+        </w:rPr>
+      </w:pPr>
+    </w:p>
+    <w:p>
+      <w:pPr>
+        <w:rPr>
+          <w:b/>
+          <w:bCs/>
+          <w:sz w:val="28"/>
+          <w:szCs w:val="28"/>
+          <w:rtl/>
+          <w:lang w:bidi="ar-EG"/>
+        </w:rPr>
+      </w:pPr>
+    </w:p>
+    <w:p>
+      <w:pPr>
+        <w:rPr>
+          <w:b/>
+          <w:bCs/>
+          <w:sz w:val="28"/>
+          <w:szCs w:val="28"/>
+          <w:rtl/>
+          <w:lang w:bidi="ar-EG"/>
+        </w:rPr>
+      </w:pPr>
+    </w:p>
+    <w:p>
+      <w:pPr>
+        <w:rPr>
+          <w:b/>
+          <w:bCs/>
+          <w:sz w:val="28"/>
+          <w:szCs w:val="28"/>
+          <w:rtl/>
+          <w:lang w:bidi="ar-EG"/>
+        </w:rPr>
+      </w:pPr>
+    </w:p>
+    <w:p>
+      <w:pPr>
+        <w:rPr>
+          <w:b/>
+          <w:bCs/>
+          <w:sz w:val="28"/>
+          <w:szCs w:val="28"/>
+          <w:rtl/>
+          <w:lang w:bidi="ar-EG"/>
+        </w:rPr>
+      </w:pPr>
+    </w:p>
+    <w:p>
+      <w:pPr>
+        <w:rPr>
+          <w:b/>
+          <w:bCs/>
+          <w:sz w:val="28"/>
+          <w:szCs w:val="28"/>
+          <w:rtl/>
+          <w:lang w:bidi="ar-EG"/>
+        </w:rPr>
+      </w:pPr>
+    </w:p>
+    <w:p>
+      <w:pPr>
+        <w:rPr>
+          <w:b/>
+          <w:bCs/>
+          <w:sz w:val="28"/>
+          <w:szCs w:val="28"/>
+          <w:rtl/>
+          <w:lang w:bidi="ar-EG"/>
+        </w:rPr>
+      </w:pPr>
+    </w:p>
+    <w:p>
+      <w:pPr>
+        <w:rPr>
+          <w:b/>
+          <w:bCs/>
+          <w:sz w:val="28"/>
+          <w:szCs w:val="28"/>
+          <w:rtl/>
+          <w:lang w:bidi="ar-EG"/>
+        </w:rPr>
+      </w:pPr>
+    </w:p>
+    <w:p>
+      <w:pPr>
+        <w:rPr>
+          <w:b/>
+          <w:bCs/>
+          <w:sz w:val="28"/>
+          <w:szCs w:val="28"/>
+          <w:rtl/>
+          <w:lang w:bidi="ar-EG"/>
+        </w:rPr>
+      </w:pPr>
+    </w:p>
+    <w:p>
+      <w:pPr>
+        <w:rPr>
+          <w:b/>
+          <w:bCs/>
+          <w:sz w:val="28"/>
+          <w:szCs w:val="28"/>
+          <w:rtl/>
+          <w:lang w:bidi="ar-EG"/>
+        </w:rPr>
+      </w:pPr>
+    </w:p>
+    <w:p>
+      <w:pPr>
+        <w:rPr>
+          <w:b/>
+          <w:bCs/>
+          <w:sz w:val="28"/>
+          <w:szCs w:val="28"/>
+          <w:rtl/>
+          <w:lang w:bidi="ar-EG"/>
+        </w:rPr>
+      </w:pPr>
+    </w:p>
+    <w:p>
+      <w:pPr>
+        <w:rPr>
+          <w:b/>
+          <w:bCs/>
+          <w:sz w:val="28"/>
+          <w:szCs w:val="28"/>
+          <w:rtl/>
+          <w:lang w:bidi="ar-EG"/>
+        </w:rPr>
+      </w:pPr>
+    </w:p>
+    <w:p>
+      <w:pPr>
+        <w:rPr>
+          <w:b/>
+          <w:bCs/>
+          <w:sz w:val="28"/>
+          <w:szCs w:val="28"/>
+          <w:lang w:bidi="ar-EG"/>
+        </w:rPr>
+      </w:pPr>
+    </w:p>
+    <w:p>
+      <w:pPr>
+        <w:rPr>
+          <w:b/>
+          <w:bCs/>
+          <w:sz w:val="28"/>
+          <w:szCs w:val="28"/>
+          <w:lang w:bidi="ar-EG"/>
+        </w:rPr>
+      </w:pPr>
+      <w:r>
+        <w:rPr>
+          <w:b/>
+          <w:bCs/>
+          <w:sz w:val="32"/>
+          <w:szCs w:val="32"/>
+          <w:lang w:bidi="ar-EG"/>
+        </w:rPr>
+        <w:lastRenderedPageBreak/>
         <w:t xml:space="preserve"> </w:t>
       </w:r>
       <w:r>
@@ -5443,6 +5691,7 @@
         <w:rPr>
           <w:b/>
           <w:bCs/>
+          <w:rtl/>
           <w:lang w:bidi="ar-EG"/>
         </w:rPr>
       </w:pPr>
@@ -5460,87 +5709,132 @@
         <w:rPr>
           <w:b/>
           <w:bCs/>
-          <w:sz w:val="32"/>
-          <w:szCs w:val="32"/>
-          <w:lang w:bidi="ar-EG"/>
-        </w:rPr>
-      </w:pPr>
-    </w:p>
-    <w:p>
-      <w:pPr>
-        <w:rPr>
-          <w:b/>
-          <w:bCs/>
-          <w:sz w:val="32"/>
-          <w:szCs w:val="32"/>
-          <w:lang w:bidi="ar-EG"/>
-        </w:rPr>
-      </w:pPr>
-    </w:p>
-    <w:p>
-      <w:pPr>
-        <w:rPr>
-          <w:b/>
-          <w:bCs/>
-          <w:sz w:val="32"/>
-          <w:szCs w:val="32"/>
-          <w:lang w:bidi="ar-EG"/>
-        </w:rPr>
-      </w:pPr>
-    </w:p>
-    <w:p>
-      <w:pPr>
-        <w:rPr>
-          <w:b/>
-          <w:bCs/>
-          <w:sz w:val="32"/>
-          <w:szCs w:val="32"/>
-          <w:lang w:bidi="ar-EG"/>
-        </w:rPr>
-      </w:pPr>
-    </w:p>
-    <w:p>
-      <w:pPr>
-        <w:rPr>
-          <w:b/>
-          <w:bCs/>
-          <w:sz w:val="32"/>
-          <w:szCs w:val="32"/>
-          <w:lang w:bidi="ar-EG"/>
-        </w:rPr>
-      </w:pPr>
-    </w:p>
-    <w:p>
-      <w:pPr>
-        <w:rPr>
-          <w:b/>
-          <w:bCs/>
-          <w:sz w:val="32"/>
-          <w:szCs w:val="32"/>
-          <w:lang w:bidi="ar-EG"/>
-        </w:rPr>
-      </w:pPr>
-    </w:p>
-    <w:p>
-      <w:pPr>
-        <w:rPr>
-          <w:b/>
-          <w:bCs/>
-          <w:sz w:val="28"/>
-          <w:szCs w:val="28"/>
-          <w:lang w:bidi="ar-EG"/>
-        </w:rPr>
-      </w:pPr>
-      <w:r>
-        <w:rPr>
-          <w:b/>
-          <w:bCs/>
-          <w:sz w:val="28"/>
-          <w:szCs w:val="28"/>
-          <w:lang w:bidi="ar-EG"/>
-        </w:rPr>
-        <w:t xml:space="preserve">   2.2.5 Entity Relationship Diagram (ERD)</w:t>
-      </w:r>
+          <w:lang w:bidi="ar-EG"/>
+        </w:rPr>
+      </w:pPr>
+      <w:r>
+        <w:rPr>
+          <w:b/>
+          <w:bCs/>
+          <w:sz w:val="32"/>
+          <w:szCs w:val="32"/>
+          <w:lang w:bidi="ar-EG"/>
+        </w:rPr>
+        <w:drawing>
+          <wp:inline distT="0" distB="0" distL="0" distR="0" wp14:anchorId="41C75810" wp14:editId="3FB10AB8">
+            <wp:extent cx="5943600" cy="4461658"/>
+            <wp:effectExtent l="0" t="0" r="0" b="0"/>
+            <wp:docPr id="1354319659" name="Picture 2" descr="A white background with black text&#10;&#10;AI-generated content may be incorrect."/>
+            <wp:cNvGraphicFramePr>
+              <a:graphicFrameLocks xmlns:a="http://schemas.openxmlformats.org/drawingml/2006/main" noChangeAspect="1"/>
+            </wp:cNvGraphicFramePr>
+            <a:graphic xmlns:a="http://schemas.openxmlformats.org/drawingml/2006/main">
+              <a:graphicData uri="http://schemas.openxmlformats.org/drawingml/2006/picture">
+                <pic:pic xmlns:pic="http://schemas.openxmlformats.org/drawingml/2006/picture">
+                  <pic:nvPicPr>
+                    <pic:cNvPr id="1354319659" name="Picture 2" descr="A white background with black text&#10;&#10;AI-generated content may be incorrect."/>
+                    <pic:cNvPicPr>
+                      <a:picLocks noChangeAspect="1" noChangeArrowheads="1"/>
+                    </pic:cNvPicPr>
+                  </pic:nvPicPr>
+                  <pic:blipFill>
+                    <a:blip r:embed="rId18" cstate="print">
+                      <a:extLst>
+                        <a:ext uri="{28A0092B-C50C-407E-A947-70E740481C1C}">
+                          <a14:useLocalDpi xmlns:a14="http://schemas.microsoft.com/office/drawing/2010/main" val="0"/>
+                        </a:ext>
+                      </a:extLst>
+                    </a:blip>
+                    <a:srcRect/>
+                    <a:stretch>
+                      <a:fillRect/>
+                    </a:stretch>
+                  </pic:blipFill>
+                  <pic:spPr bwMode="auto">
+                    <a:xfrm>
+                      <a:off x="0" y="0"/>
+                      <a:ext cx="5943600" cy="4461658"/>
+                    </a:xfrm>
+                    <a:prstGeom prst="rect">
+                      <a:avLst/>
+                    </a:prstGeom>
+                    <a:noFill/>
+                    <a:ln>
+                      <a:noFill/>
+                    </a:ln>
+                  </pic:spPr>
+                </pic:pic>
+              </a:graphicData>
+            </a:graphic>
+          </wp:inline>
+        </w:drawing>
+      </w:r>
+    </w:p>
+    <w:p>
+      <w:pPr>
+        <w:rPr>
+          <w:b/>
+          <w:bCs/>
+          <w:sz w:val="32"/>
+          <w:szCs w:val="32"/>
+          <w:lang w:bidi="ar-EG"/>
+        </w:rPr>
+      </w:pPr>
+    </w:p>
+    <w:p>
+      <w:pPr>
+        <w:rPr>
+          <w:b/>
+          <w:bCs/>
+          <w:sz w:val="32"/>
+          <w:szCs w:val="32"/>
+          <w:lang w:bidi="ar-EG"/>
+        </w:rPr>
+      </w:pPr>
+    </w:p>
+    <w:p>
+      <w:pPr>
+        <w:rPr>
+          <w:b/>
+          <w:bCs/>
+          <w:sz w:val="32"/>
+          <w:szCs w:val="32"/>
+          <w:lang w:bidi="ar-EG"/>
+        </w:rPr>
+      </w:pPr>
+    </w:p>
+    <w:p>
+      <w:pPr>
+        <w:rPr>
+          <w:b/>
+          <w:bCs/>
+          <w:sz w:val="32"/>
+          <w:szCs w:val="32"/>
+          <w:lang w:bidi="ar-EG"/>
+        </w:rPr>
+      </w:pPr>
+    </w:p>
+    <w:p>
+      <w:pPr>
+        <w:rPr>
+          <w:b/>
+          <w:bCs/>
+          <w:sz w:val="32"/>
+          <w:szCs w:val="32"/>
+          <w:lang w:bidi="ar-EG"/>
+        </w:rPr>
+      </w:pPr>
+    </w:p>
+    <w:p>
+      <w:pPr>
+        <w:rPr>
+          <w:b/>
+          <w:bCs/>
+          <w:sz w:val="32"/>
+          <w:szCs w:val="32"/>
+          <w:lang w:bidi="ar-EG"/>
+        </w:rPr>
+      </w:pPr>
     </w:p>
     <w:p>
       <w:pPr>
@@ -5739,6 +6033,7 @@
           <w:szCs w:val="96"/>
           <w:lang w:bidi="ar-EG"/>
         </w:rPr>
+        <w:lastRenderedPageBreak/>
         <w:t>References</w:t>
       </w:r>
     </w:p>
@@ -5920,7 +6215,7 @@
 </file>
 
 <file path=word/endnotes.xml><?xml version="1.0" encoding="utf-8"?>
-<w:endnotes xmlns:wpc="http://schemas.microsoft.com/office/word/2010/wordprocessingCanvas" xmlns:cx="http://schemas.microsoft.com/office/drawing/2014/chartex" xmlns:cx1="http://schemas.microsoft.com/office/drawing/2015/9/8/chartex" xmlns:cx2="http://schemas.microsoft.com/office/drawing/2015/10/21/chartex" xmlns:cx3="http://schemas.microsoft.com/office/drawing/2016/5/9/chartex" xmlns:cx4="http://schemas.microsoft.com/office/drawing/2016/5/10/chartex" xmlns:cx5="http://schemas.microsoft.com/office/drawing/2016/5/11/chartex" xmlns:cx6="http://schemas.microsoft.com/office/drawing/2016/5/12/chartex" xmlns:cx7="http://schemas.microsoft.com/office/drawing/2016/5/13/chartex" xmlns:cx8="http://schemas.microsoft.com/office/drawing/2016/5/14/chartex" xmlns:mc="http://schemas.openxmlformats.org/markup-compatibility/2006" xmlns:aink="http://schemas.microsoft.com/office/drawing/2016/ink" xmlns:am3d="http://schemas.microsoft.com/office/drawing/2017/model3d" xmlns:o="urn:schemas-microsoft-com:office:office" xmlns:r="http://schemas.openxmlformats.org/officeDocument/2006/relationships" xmlns:m="http://schemas.openxmlformats.org/officeDocument/2006/math" xmlns:v="urn:schemas-microsoft-com:vml" xmlns:wp14="http://schemas.microsoft.com/office/word/2010/wordprocessingDrawing" xmlns:wp="http://schemas.openxmlformats.org/drawingml/2006/wordprocessingDrawing" xmlns:w10="urn:schemas-microsoft-com:office:word" xmlns:w="http://schemas.openxmlformats.org/wordprocessingml/2006/main" xmlns:w14="http://schemas.microsoft.com/office/word/2010/wordml" xmlns:w15="http://schemas.microsoft.com/office/word/2012/wordml" xmlns:w16cex="http://schemas.microsoft.com/office/word/2018/wordml/cex" xmlns:w16cid="http://schemas.microsoft.com/office/word/2016/wordml/cid" xmlns:w16="http://schemas.microsoft.com/office/word/2018/wordml" xmlns:w16sdtdh="http://schemas.microsoft.com/office/word/2020/wordml/sdtdatahash" xmlns:w16se="http://schemas.microsoft.com/office/word/2015/wordml/symex" xmlns:wpg="http://schemas.microsoft.com/office/word/2010/wordprocessingGroup" xmlns:wpi="http://schemas.microsoft.com/office/word/2010/wordprocessingInk" xmlns:wne="http://schemas.microsoft.com/office/word/2006/wordml" xmlns:wps="http://schemas.microsoft.com/office/word/2010/wordprocessingShape" mc:Ignorable="w14 w15 w16se w16cid w16 w16cex w16sdtdh wp14">
+<w:endnotes xmlns:wpc="http://schemas.microsoft.com/office/word/2010/wordprocessingCanvas" xmlns:cx="http://schemas.microsoft.com/office/drawing/2014/chartex" xmlns:cx1="http://schemas.microsoft.com/office/drawing/2015/9/8/chartex" xmlns:cx2="http://schemas.microsoft.com/office/drawing/2015/10/21/chartex" xmlns:cx3="http://schemas.microsoft.com/office/drawing/2016/5/9/chartex" xmlns:cx4="http://schemas.microsoft.com/office/drawing/2016/5/10/chartex" xmlns:cx5="http://schemas.microsoft.com/office/drawing/2016/5/11/chartex" xmlns:cx6="http://schemas.microsoft.com/office/drawing/2016/5/12/chartex" xmlns:cx7="http://schemas.microsoft.com/office/drawing/2016/5/13/chartex" xmlns:cx8="http://schemas.microsoft.com/office/drawing/2016/5/14/chartex" xmlns:mc="http://schemas.openxmlformats.org/markup-compatibility/2006" xmlns:aink="http://schemas.microsoft.com/office/drawing/2016/ink" xmlns:am3d="http://schemas.microsoft.com/office/drawing/2017/model3d" xmlns:o="urn:schemas-microsoft-com:office:office" xmlns:oel="http://schemas.microsoft.com/office/2019/extlst" xmlns:r="http://schemas.openxmlformats.org/officeDocument/2006/relationships" xmlns:m="http://schemas.openxmlformats.org/officeDocument/2006/math" xmlns:v="urn:schemas-microsoft-com:vml" xmlns:wp14="http://schemas.microsoft.com/office/word/2010/wordprocessingDrawing" xmlns:wp="http://schemas.openxmlformats.org/drawingml/2006/wordprocessingDrawing" xmlns:w10="urn:schemas-microsoft-com:office:word" xmlns:w="http://schemas.openxmlformats.org/wordprocessingml/2006/main" xmlns:w14="http://schemas.microsoft.com/office/word/2010/wordml" xmlns:w15="http://schemas.microsoft.com/office/word/2012/wordml" xmlns:w16cex="http://schemas.microsoft.com/office/word/2018/wordml/cex" xmlns:w16cid="http://schemas.microsoft.com/office/word/2016/wordml/cid" xmlns:w16="http://schemas.microsoft.com/office/word/2018/wordml" xmlns:w16du="http://schemas.microsoft.com/office/word/2023/wordml/word16du" xmlns:w16sdtdh="http://schemas.microsoft.com/office/word/2020/wordml/sdtdatahash" xmlns:w16sdtfl="http://schemas.microsoft.com/office/word/2024/wordml/sdtformatlock" xmlns:w16se="http://schemas.microsoft.com/office/word/2015/wordml/symex" xmlns:wpg="http://schemas.microsoft.com/office/word/2010/wordprocessingGroup" xmlns:wpi="http://schemas.microsoft.com/office/word/2010/wordprocessingInk" xmlns:wne="http://schemas.microsoft.com/office/word/2006/wordml" xmlns:wps="http://schemas.microsoft.com/office/word/2010/wordprocessingShape" mc:Ignorable="w14 w15 w16se w16cid w16 w16cex w16sdtdh w16sdtfl w16du wp14">
   <w:endnote w:type="separator" w:id="-1">
     <w:p>
       <w:pPr>
@@ -5945,7 +6240,7 @@
 </file>
 
 <file path=word/footnotes.xml><?xml version="1.0" encoding="utf-8"?>
-<w:footnotes xmlns:wpc="http://schemas.microsoft.com/office/word/2010/wordprocessingCanvas" xmlns:cx="http://schemas.microsoft.com/office/drawing/2014/chartex" xmlns:cx1="http://schemas.microsoft.com/office/drawing/2015/9/8/chartex" xmlns:cx2="http://schemas.microsoft.com/office/drawing/2015/10/21/chartex" xmlns:cx3="http://schemas.microsoft.com/office/drawing/2016/5/9/chartex" xmlns:cx4="http://schemas.microsoft.com/office/drawing/2016/5/10/chartex" xmlns:cx5="http://schemas.microsoft.com/office/drawing/2016/5/11/chartex" xmlns:cx6="http://schemas.microsoft.com/office/drawing/2016/5/12/chartex" xmlns:cx7="http://schemas.microsoft.com/office/drawing/2016/5/13/chartex" xmlns:cx8="http://schemas.microsoft.com/office/drawing/2016/5/14/chartex" xmlns:mc="http://schemas.openxmlformats.org/markup-compatibility/2006" xmlns:aink="http://schemas.microsoft.com/office/drawing/2016/ink" xmlns:am3d="http://schemas.microsoft.com/office/drawing/2017/model3d" xmlns:o="urn:schemas-microsoft-com:office:office" xmlns:r="http://schemas.openxmlformats.org/officeDocument/2006/relationships" xmlns:m="http://schemas.openxmlformats.org/officeDocument/2006/math" xmlns:v="urn:schemas-microsoft-com:vml" xmlns:wp14="http://schemas.microsoft.com/office/word/2010/wordprocessingDrawing" xmlns:wp="http://schemas.openxmlformats.org/drawingml/2006/wordprocessingDrawing" xmlns:w10="urn:schemas-microsoft-com:office:word" xmlns:w="http://schemas.openxmlformats.org/wordprocessingml/2006/main" xmlns:w14="http://schemas.microsoft.com/office/word/2010/wordml" xmlns:w15="http://schemas.microsoft.com/office/word/2012/wordml" xmlns:w16cex="http://schemas.microsoft.com/office/word/2018/wordml/cex" xmlns:w16cid="http://schemas.microsoft.com/office/word/2016/wordml/cid" xmlns:w16="http://schemas.microsoft.com/office/word/2018/wordml" xmlns:w16sdtdh="http://schemas.microsoft.com/office/word/2020/wordml/sdtdatahash" xmlns:w16se="http://schemas.microsoft.com/office/word/2015/wordml/symex" xmlns:wpg="http://schemas.microsoft.com/office/word/2010/wordprocessingGroup" xmlns:wpi="http://schemas.microsoft.com/office/word/2010/wordprocessingInk" xmlns:wne="http://schemas.microsoft.com/office/word/2006/wordml" xmlns:wps="http://schemas.microsoft.com/office/word/2010/wordprocessingShape" mc:Ignorable="w14 w15 w16se w16cid w16 w16cex w16sdtdh wp14">
+<w:footnotes xmlns:wpc="http://schemas.microsoft.com/office/word/2010/wordprocessingCanvas" xmlns:cx="http://schemas.microsoft.com/office/drawing/2014/chartex" xmlns:cx1="http://schemas.microsoft.com/office/drawing/2015/9/8/chartex" xmlns:cx2="http://schemas.microsoft.com/office/drawing/2015/10/21/chartex" xmlns:cx3="http://schemas.microsoft.com/office/drawing/2016/5/9/chartex" xmlns:cx4="http://schemas.microsoft.com/office/drawing/2016/5/10/chartex" xmlns:cx5="http://schemas.microsoft.com/office/drawing/2016/5/11/chartex" xmlns:cx6="http://schemas.microsoft.com/office/drawing/2016/5/12/chartex" xmlns:cx7="http://schemas.microsoft.com/office/drawing/2016/5/13/chartex" xmlns:cx8="http://schemas.microsoft.com/office/drawing/2016/5/14/chartex" xmlns:mc="http://schemas.openxmlformats.org/markup-compatibility/2006" xmlns:aink="http://schemas.microsoft.com/office/drawing/2016/ink" xmlns:am3d="http://schemas.microsoft.com/office/drawing/2017/model3d" xmlns:o="urn:schemas-microsoft-com:office:office" xmlns:oel="http://schemas.microsoft.com/office/2019/extlst" xmlns:r="http://schemas.openxmlformats.org/officeDocument/2006/relationships" xmlns:m="http://schemas.openxmlformats.org/officeDocument/2006/math" xmlns:v="urn:schemas-microsoft-com:vml" xmlns:wp14="http://schemas.microsoft.com/office/word/2010/wordprocessingDrawing" xmlns:wp="http://schemas.openxmlformats.org/drawingml/2006/wordprocessingDrawing" xmlns:w10="urn:schemas-microsoft-com:office:word" xmlns:w="http://schemas.openxmlformats.org/wordprocessingml/2006/main" xmlns:w14="http://schemas.microsoft.com/office/word/2010/wordml" xmlns:w15="http://schemas.microsoft.com/office/word/2012/wordml" xmlns:w16cex="http://schemas.microsoft.com/office/word/2018/wordml/cex" xmlns:w16cid="http://schemas.microsoft.com/office/word/2016/wordml/cid" xmlns:w16="http://schemas.microsoft.com/office/word/2018/wordml" xmlns:w16du="http://schemas.microsoft.com/office/word/2023/wordml/word16du" xmlns:w16sdtdh="http://schemas.microsoft.com/office/word/2020/wordml/sdtdatahash" xmlns:w16sdtfl="http://schemas.microsoft.com/office/word/2024/wordml/sdtformatlock" xmlns:w16se="http://schemas.microsoft.com/office/word/2015/wordml/symex" xmlns:wpg="http://schemas.microsoft.com/office/word/2010/wordprocessingGroup" xmlns:wpi="http://schemas.microsoft.com/office/word/2010/wordprocessingInk" xmlns:wne="http://schemas.microsoft.com/office/word/2006/wordml" xmlns:wps="http://schemas.microsoft.com/office/word/2010/wordprocessingShape" mc:Ignorable="w14 w15 w16se w16cid w16 w16cex w16sdtdh w16sdtfl w16du wp14">
   <w:footnote w:type="separator" w:id="-1">
     <w:p>
       <w:pPr>
@@ -5970,7 +6265,7 @@
 </file>
 
 <file path=word/numbering.xml><?xml version="1.0" encoding="utf-8"?>
-<w:numbering xmlns:wpc="http://schemas.microsoft.com/office/word/2010/wordprocessingCanvas" xmlns:cx="http://schemas.microsoft.com/office/drawing/2014/chartex" xmlns:cx1="http://schemas.microsoft.com/office/drawing/2015/9/8/chartex" xmlns:cx2="http://schemas.microsoft.com/office/drawing/2015/10/21/chartex" xmlns:cx3="http://schemas.microsoft.com/office/drawing/2016/5/9/chartex" xmlns:cx4="http://schemas.microsoft.com/office/drawing/2016/5/10/chartex" xmlns:cx5="http://schemas.microsoft.com/office/drawing/2016/5/11/chartex" xmlns:cx6="http://schemas.microsoft.com/office/drawing/2016/5/12/chartex" xmlns:cx7="http://schemas.microsoft.com/office/drawing/2016/5/13/chartex" xmlns:cx8="http://schemas.microsoft.com/office/drawing/2016/5/14/chartex" xmlns:mc="http://schemas.openxmlformats.org/markup-compatibility/2006" xmlns:aink="http://schemas.microsoft.com/office/drawing/2016/ink" xmlns:am3d="http://schemas.microsoft.com/office/drawing/2017/model3d" xmlns:o="urn:schemas-microsoft-com:office:office" xmlns:r="http://schemas.openxmlformats.org/officeDocument/2006/relationships" xmlns:m="http://schemas.openxmlformats.org/officeDocument/2006/math" xmlns:v="urn:schemas-microsoft-com:vml" xmlns:wp14="http://schemas.microsoft.com/office/word/2010/wordprocessingDrawing" xmlns:wp="http://schemas.openxmlformats.org/drawingml/2006/wordprocessingDrawing" xmlns:w10="urn:schemas-microsoft-com:office:word" xmlns:w="http://schemas.openxmlformats.org/wordprocessingml/2006/main" xmlns:w14="http://schemas.microsoft.com/office/word/2010/wordml" xmlns:w15="http://schemas.microsoft.com/office/word/2012/wordml" xmlns:w16cex="http://schemas.microsoft.com/office/word/2018/wordml/cex" xmlns:w16cid="http://schemas.microsoft.com/office/word/2016/wordml/cid" xmlns:w16="http://schemas.microsoft.com/office/word/2018/wordml" xmlns:w16sdtdh="http://schemas.microsoft.com/office/word/2020/wordml/sdtdatahash" xmlns:w16se="http://schemas.microsoft.com/office/word/2015/wordml/symex" xmlns:wpg="http://schemas.microsoft.com/office/word/2010/wordprocessingGroup" xmlns:wpi="http://schemas.microsoft.com/office/word/2010/wordprocessingInk" xmlns:wne="http://schemas.microsoft.com/office/word/2006/wordml" xmlns:wps="http://schemas.microsoft.com/office/word/2010/wordprocessingShape" mc:Ignorable="w14 w15 w16se w16cid w16 w16cex w16sdtdh wp14">
+<w:numbering xmlns:wpc="http://schemas.microsoft.com/office/word/2010/wordprocessingCanvas" xmlns:cx="http://schemas.microsoft.com/office/drawing/2014/chartex" xmlns:cx1="http://schemas.microsoft.com/office/drawing/2015/9/8/chartex" xmlns:cx2="http://schemas.microsoft.com/office/drawing/2015/10/21/chartex" xmlns:cx3="http://schemas.microsoft.com/office/drawing/2016/5/9/chartex" xmlns:cx4="http://schemas.microsoft.com/office/drawing/2016/5/10/chartex" xmlns:cx5="http://schemas.microsoft.com/office/drawing/2016/5/11/chartex" xmlns:cx6="http://schemas.microsoft.com/office/drawing/2016/5/12/chartex" xmlns:cx7="http://schemas.microsoft.com/office/drawing/2016/5/13/chartex" xmlns:cx8="http://schemas.microsoft.com/office/drawing/2016/5/14/chartex" xmlns:mc="http://schemas.openxmlformats.org/markup-compatibility/2006" xmlns:aink="http://schemas.microsoft.com/office/drawing/2016/ink" xmlns:am3d="http://schemas.microsoft.com/office/drawing/2017/model3d" xmlns:o="urn:schemas-microsoft-com:office:office" xmlns:oel="http://schemas.microsoft.com/office/2019/extlst" xmlns:r="http://schemas.openxmlformats.org/officeDocument/2006/relationships" xmlns:m="http://schemas.openxmlformats.org/officeDocument/2006/math" xmlns:v="urn:schemas-microsoft-com:vml" xmlns:wp14="http://schemas.microsoft.com/office/word/2010/wordprocessingDrawing" xmlns:wp="http://schemas.openxmlformats.org/drawingml/2006/wordprocessingDrawing" xmlns:w10="urn:schemas-microsoft-com:office:word" xmlns:w="http://schemas.openxmlformats.org/wordprocessingml/2006/main" xmlns:w14="http://schemas.microsoft.com/office/word/2010/wordml" xmlns:w15="http://schemas.microsoft.com/office/word/2012/wordml" xmlns:w16cex="http://schemas.microsoft.com/office/word/2018/wordml/cex" xmlns:w16cid="http://schemas.microsoft.com/office/word/2016/wordml/cid" xmlns:w16="http://schemas.microsoft.com/office/word/2018/wordml" xmlns:w16du="http://schemas.microsoft.com/office/word/2023/wordml/word16du" xmlns:w16sdtdh="http://schemas.microsoft.com/office/word/2020/wordml/sdtdatahash" xmlns:w16sdtfl="http://schemas.microsoft.com/office/word/2024/wordml/sdtformatlock" xmlns:w16se="http://schemas.microsoft.com/office/word/2015/wordml/symex" xmlns:wpg="http://schemas.microsoft.com/office/word/2010/wordprocessingGroup" xmlns:wpi="http://schemas.microsoft.com/office/word/2010/wordprocessingInk" xmlns:wne="http://schemas.microsoft.com/office/word/2006/wordml" xmlns:wps="http://schemas.microsoft.com/office/word/2010/wordprocessingShape" mc:Ignorable="w14 w15 w16se w16cid w16 w16cex w16sdtdh w16sdtfl w16du wp14">
   <w:abstractNum w:abstractNumId="0" w15:restartNumberingAfterBreak="0">
     <w:nsid w:val="18F817FD"/>
     <w:multiLevelType w:val="multilevel"/>
@@ -6310,20 +6605,20 @@
       </w:rPr>
     </w:lvl>
   </w:abstractNum>
-  <w:num w:numId="1">
+  <w:num w:numId="1" w16cid:durableId="252012820">
     <w:abstractNumId w:val="1"/>
   </w:num>
-  <w:num w:numId="2">
+  <w:num w:numId="2" w16cid:durableId="1844466628">
     <w:abstractNumId w:val="0"/>
   </w:num>
-  <w:num w:numId="3">
+  <w:num w:numId="3" w16cid:durableId="1939554271">
     <w:abstractNumId w:val="2"/>
   </w:num>
 </w:numbering>
 </file>
 
 <file path=word/styles.xml><?xml version="1.0" encoding="utf-8"?>
-<w:styles xmlns:mc="http://schemas.openxmlformats.org/markup-compatibility/2006" xmlns:r="http://schemas.openxmlformats.org/officeDocument/2006/relationships" xmlns:w="http://schemas.openxmlformats.org/wordprocessingml/2006/main" xmlns:w14="http://schemas.microsoft.com/office/word/2010/wordml" xmlns:w15="http://schemas.microsoft.com/office/word/2012/wordml" xmlns:w16cex="http://schemas.microsoft.com/office/word/2018/wordml/cex" xmlns:w16cid="http://schemas.microsoft.com/office/word/2016/wordml/cid" xmlns:w16="http://schemas.microsoft.com/office/word/2018/wordml" xmlns:w16sdtdh="http://schemas.microsoft.com/office/word/2020/wordml/sdtdatahash" xmlns:w16se="http://schemas.microsoft.com/office/word/2015/wordml/symex" mc:Ignorable="w14 w15 w16se w16cid w16 w16cex w16sdtdh">
+<w:styles xmlns:mc="http://schemas.openxmlformats.org/markup-compatibility/2006" xmlns:r="http://schemas.openxmlformats.org/officeDocument/2006/relationships" xmlns:w="http://schemas.openxmlformats.org/wordprocessingml/2006/main" xmlns:w14="http://schemas.microsoft.com/office/word/2010/wordml" xmlns:w15="http://schemas.microsoft.com/office/word/2012/wordml" xmlns:w16cex="http://schemas.microsoft.com/office/word/2018/wordml/cex" xmlns:w16cid="http://schemas.microsoft.com/office/word/2016/wordml/cid" xmlns:w16="http://schemas.microsoft.com/office/word/2018/wordml" xmlns:w16du="http://schemas.microsoft.com/office/word/2023/wordml/word16du" xmlns:w16sdtdh="http://schemas.microsoft.com/office/word/2020/wordml/sdtdatahash" xmlns:w16sdtfl="http://schemas.microsoft.com/office/word/2024/wordml/sdtformatlock" xmlns:w16se="http://schemas.microsoft.com/office/word/2015/wordml/symex" mc:Ignorable="w14 w15 w16se w16cid w16 w16cex w16sdtdh w16sdtfl w16du">
   <w:docDefaults>
     <w:rPrDefault>
       <w:rPr>
@@ -6917,7 +7212,6 @@
   <w:style w:type="character" w:default="1" w:styleId="DefaultParagraphFont">
     <w:name w:val="Default Paragraph Font"/>
     <w:uiPriority w:val="1"/>
-    <w:semiHidden/>
     <w:unhideWhenUsed/>
   </w:style>
   <w:style w:type="table" w:default="1" w:styleId="TableNormal">
@@ -7500,11 +7794,12 @@
 </file>
 
 <file path=customXml/item1.xml><?xml version="1.0" encoding="utf-8"?>
-<p:properties xmlns:p="http://schemas.microsoft.com/office/2006/metadata/properties" xmlns:xsi="http://www.w3.org/2001/XMLSchema-instance" xmlns:pc="http://schemas.microsoft.com/office/infopath/2007/PartnerControls">
-  <documentManagement>
-    <_activity xmlns="96653d63-05fe-4a84-9c57-0b23c79feb37" xsi:nil="true"/>
-  </documentManagement>
-</p:properties>
+<?mso-contentType ?>
+<FormTemplates xmlns="http://schemas.microsoft.com/sharepoint/v3/contenttype/forms">
+  <Display>DocumentLibraryForm</Display>
+  <Edit>DocumentLibraryForm</Edit>
+  <New>DocumentLibraryForm</New>
+</FormTemplates>
 </file>
 
 <file path=customXml/item2.xml><?xml version="1.0" encoding="utf-8"?>
@@ -7729,20 +8024,17 @@
 </file>
 
 <file path=customXml/item3.xml><?xml version="1.0" encoding="utf-8"?>
-<?mso-contentType ?>
-<FormTemplates xmlns="http://schemas.microsoft.com/sharepoint/v3/contenttype/forms">
-  <Display>DocumentLibraryForm</Display>
-  <Edit>DocumentLibraryForm</Edit>
-  <New>DocumentLibraryForm</New>
-</FormTemplates>
+<p:properties xmlns:p="http://schemas.microsoft.com/office/2006/metadata/properties" xmlns:xsi="http://www.w3.org/2001/XMLSchema-instance" xmlns:pc="http://schemas.microsoft.com/office/infopath/2007/PartnerControls">
+  <documentManagement>
+    <_activity xmlns="96653d63-05fe-4a84-9c57-0b23c79feb37" xsi:nil="true"/>
+  </documentManagement>
+</p:properties>
 </file>
 
 <file path=customXml/itemProps1.xml><?xml version="1.0" encoding="utf-8"?>
-<ds:datastoreItem xmlns:ds="http://schemas.openxmlformats.org/officeDocument/2006/customXml" ds:itemID="{149BEE02-6ECD-4B5E-95A0-862095D76CA8}">
+<ds:datastoreItem xmlns:ds="http://schemas.openxmlformats.org/officeDocument/2006/customXml" ds:itemID="{CAD54D8A-D749-4106-B26D-32544D3E57D0}">
   <ds:schemaRefs>
-    <ds:schemaRef ds:uri="http://schemas.microsoft.com/office/2006/metadata/properties"/>
-    <ds:schemaRef ds:uri="http://schemas.microsoft.com/office/infopath/2007/PartnerControls"/>
-    <ds:schemaRef ds:uri="96653d63-05fe-4a84-9c57-0b23c79feb37"/>
+    <ds:schemaRef ds:uri="http://schemas.microsoft.com/sharepoint/v3/contenttype/forms"/>
   </ds:schemaRefs>
 </ds:datastoreItem>
 </file>
@@ -7767,9 +8059,11 @@
 </file>
 
 <file path=customXml/itemProps3.xml><?xml version="1.0" encoding="utf-8"?>
-<ds:datastoreItem xmlns:ds="http://schemas.openxmlformats.org/officeDocument/2006/customXml" ds:itemID="{CAD54D8A-D749-4106-B26D-32544D3E57D0}">
+<ds:datastoreItem xmlns:ds="http://schemas.openxmlformats.org/officeDocument/2006/customXml" ds:itemID="{149BEE02-6ECD-4B5E-95A0-862095D76CA8}">
   <ds:schemaRefs>
-    <ds:schemaRef ds:uri="http://schemas.microsoft.com/sharepoint/v3/contenttype/forms"/>
+    <ds:schemaRef ds:uri="http://schemas.microsoft.com/office/2006/metadata/properties"/>
+    <ds:schemaRef ds:uri="http://schemas.microsoft.com/office/infopath/2007/PartnerControls"/>
+    <ds:schemaRef ds:uri="96653d63-05fe-4a84-9c57-0b23c79feb37"/>
   </ds:schemaRefs>
 </ds:datastoreItem>
 </file>
</xml_diff>